<commit_message>
docs(mock-interview): Câu 10 [SENIOR] System Design demo Step 1-2
- Framework RESHADED 5 step cho 45 phút interview
- Step 1 CLARIFY: 8 câu FR/NFR + giải thích thuật ngữ (peak rps, P95, SLA chuỗi, RPO/RTO)
- Step 2 ESTIMATE: anchor numbers + Tính 1 traffic / Tính 2 compute (30 pod, 10 node multi-AZ, HPA 60%, Karpenter) / Tính 3 DB IOPS (cache 80%, 4,800 IOPS, Aurora r6g.large + 2 read replica)
- Insight cache hit/miss (shock absorber, thundering herd, money math)
- Step 3-5 chưa demo, hẹn session sau

Co-Authored-By: Claude Opus 4.7 (1M context) <noreply@anthropic.com>
</commit_message>
<xml_diff>
--- a/docs/mock-interview/README.docx
+++ b/docs/mock-interview/README.docx
@@ -2,7 +2,7 @@
 <file path=word/document.xml><?xml version="1.0" encoding="utf-8"?>
 <w:document xmlns:w="http://schemas.openxmlformats.org/wordprocessingml/2006/main" xmlns:m="http://schemas.openxmlformats.org/officeDocument/2006/math" xmlns:r="http://schemas.openxmlformats.org/officeDocument/2006/relationships" xmlns:o="urn:schemas-microsoft-com:office:office" xmlns:v="urn:schemas-microsoft-com:vml" xmlns:w10="urn:schemas-microsoft-com:office:word" xmlns:a="http://schemas.openxmlformats.org/drawingml/2006/main" xmlns:pic="http://schemas.openxmlformats.org/drawingml/2006/picture" xmlns:wp="http://schemas.openxmlformats.org/drawingml/2006/wordprocessingDrawing">
   <w:body>
-    <w:bookmarkStart w:id="36" w:name="mock-interview-devopssre-senior-5"/>
+    <w:bookmarkStart w:id="50" w:name="mock-interview-devopssre-senior-5"/>
     <w:p>
       <w:pPr>
         <w:pStyle w:val="Heading1"/>
@@ -748,7 +748,7 @@
               <w:t xml:space="preserve">System design</w:t>
             </w:r>
             <w:r>
-              <w:t xml:space="preserve">: e-commerce 10K rps multi-AZ vs multi-region</w:t>
+              <w:t xml:space="preserve">: e-commerce 10K rps multi-AZ vs multi-region ✅ DEMO (Step 1-2)</w:t>
             </w:r>
           </w:p>
         </w:tc>
@@ -850,13 +850,13 @@
       </w:r>
     </w:p>
     <w:bookmarkEnd w:id="9"/>
-    <w:bookmarkStart w:id="11" w:name="tiến-độ-session-2026-05-10"/>
+    <w:bookmarkStart w:id="11" w:name="tiến-độ-session-2026-05-10-2026-05-11"/>
     <w:p>
       <w:pPr>
         <w:pStyle w:val="Heading2"/>
       </w:pPr>
       <w:r>
-        <w:t xml:space="preserve">✅ Tiến độ session 2026-05-10</w:t>
+        <w:t xml:space="preserve">✅ Tiến độ session 2026-05-10 → 2026-05-11</w:t>
       </w:r>
     </w:p>
     <w:p>
@@ -874,13 +874,13 @@
           <w:b/>
           <w:bCs/>
         </w:rPr>
-        <w:t xml:space="preserve">3 câu</w:t>
-      </w:r>
-      <w:r>
-        <w:t xml:space="preserve"> </w:t>
-      </w:r>
-      <w:r>
-        <w:t xml:space="preserve">([MID]×2 + [MID+]×1).</w:t>
+        <w:t xml:space="preserve">4 câu</w:t>
+      </w:r>
+      <w:r>
+        <w:t xml:space="preserve"> </w:t>
+      </w:r>
+      <w:r>
+        <w:t xml:space="preserve">([MID]×2 + [MID+]×1 + [SENIOR]×1 demo).</w:t>
       </w:r>
     </w:p>
     <w:bookmarkStart w:id="10" w:name="tổng-chấm-điểm-baseline"/>
@@ -1127,6 +1127,64 @@
           </w:p>
         </w:tc>
       </w:tr>
+      <w:tr>
+        <w:tc>
+          <w:tcPr/>
+          <w:p>
+            <w:pPr>
+              <w:pStyle w:val="Compact"/>
+            </w:pPr>
+            <w:r>
+              <w:t xml:space="preserve">10</w:t>
+            </w:r>
+          </w:p>
+        </w:tc>
+        <w:tc>
+          <w:tcPr/>
+          <w:p>
+            <w:pPr>
+              <w:pStyle w:val="Compact"/>
+            </w:pPr>
+            <w:r>
+              <w:t xml:space="preserve">[SENIOR]</w:t>
+            </w:r>
+          </w:p>
+        </w:tc>
+        <w:tc>
+          <w:tcPr/>
+          <w:p>
+            <w:pPr>
+              <w:pStyle w:val="Compact"/>
+            </w:pPr>
+            <w:r>
+              <w:t xml:space="preserve">Teaching mode (chưa từng làm system design)</w:t>
+            </w:r>
+          </w:p>
+        </w:tc>
+        <w:tc>
+          <w:tcPr/>
+          <w:p>
+            <w:pPr>
+              <w:pStyle w:val="Compact"/>
+            </w:pPr>
+            <w:r>
+              <w:t xml:space="preserve">Cần framework + anchor numbers; bị</w:t>
+            </w:r>
+            <w:r>
+              <w:t xml:space="preserve"> </w:t>
+            </w:r>
+            <w:r>
+              <w:t xml:space="preserve">“ngộp”</w:t>
+            </w:r>
+            <w:r>
+              <w:t xml:space="preserve"> </w:t>
+            </w:r>
+            <w:r>
+              <w:t xml:space="preserve">khi insight nhiều ý — cần ghi xuống đọc lại nhiều lần</w:t>
+            </w:r>
+          </w:p>
+        </w:tc>
+      </w:tr>
     </w:tbl>
     <w:p>
       <w:pPr>
@@ -1146,7 +1204,23 @@
         <w:t xml:space="preserve">Gap chung</w:t>
       </w:r>
       <w:r>
-        <w:t xml:space="preserve">: hiểu fundamental K8s networking (Service VIP ảo, Endpoints, kube-proxy, CoreDNS) — tầng này tách biệt với reflex sysadmin truyền thống.</w:t>
+        <w:t xml:space="preserve">: hiểu fundamental K8s networking (Service VIP ảo, Endpoints, kube-proxy, CoreDNS) +</w:t>
+      </w:r>
+      <w:r>
+        <w:t xml:space="preserve"> </w:t>
+      </w:r>
+      <w:r>
+        <w:rPr>
+          <w:b/>
+          <w:bCs/>
+        </w:rPr>
+        <w:t xml:space="preserve">system design framework</w:t>
+      </w:r>
+      <w:r>
+        <w:t xml:space="preserve"> </w:t>
+      </w:r>
+      <w:r>
+        <w:t xml:space="preserve">(RESHADED + capacity math + trade-off probe Senior) — tầng này tách biệt với reflex sysadmin truyền thống.</w:t>
       </w:r>
     </w:p>
     <w:p>
@@ -4561,22 +4635,50 @@
     </w:p>
     <w:bookmarkEnd w:id="30"/>
     <w:bookmarkEnd w:id="31"/>
-    <w:bookmarkStart w:id="33" w:name="câu-sắp-tới-next"/>
+    <w:bookmarkStart w:id="45" w:name="X1d8d7400d70a319eae79ded9ce9e77c05bdd31a"/>
     <w:p>
       <w:pPr>
         <w:pStyle w:val="Heading2"/>
       </w:pPr>
       <w:r>
-        <w:t xml:space="preserve">🎯 Câu sắp tới (NEXT)</w:t>
-      </w:r>
-    </w:p>
-    <w:bookmarkStart w:id="32" w:name="câu-4-mid-pod-oomkilled"/>
+        <w:t xml:space="preserve">📚 Câu 10 [SENIOR] — System Design e-commerce 10K rps (DEMO)</w:t>
+      </w:r>
+    </w:p>
+    <w:p>
+      <w:pPr>
+        <w:pStyle w:val="BlockText"/>
+      </w:pPr>
+      <w:r>
+        <w:rPr>
+          <w:b/>
+          <w:bCs/>
+        </w:rPr>
+        <w:t xml:space="preserve">Status</w:t>
+      </w:r>
+      <w:r>
+        <w:t xml:space="preserve">: PARTIAL demo — đi hết Step 1 (CLARIFY) + Step 2 (ESTIMATE) đến Tính 3 (DB IOPS + cache insight). Step 3-5 (Design / Deep Dive / Trade-off CEO)</w:t>
+      </w:r>
+      <w:r>
+        <w:t xml:space="preserve"> </w:t>
+      </w:r>
+      <w:r>
+        <w:rPr>
+          <w:b/>
+          <w:bCs/>
+        </w:rPr>
+        <w:t xml:space="preserve">chưa demo</w:t>
+      </w:r>
+      <w:r>
+        <w:t xml:space="preserve">, hẹn session sau khi user vững Step 1-2.</w:t>
+      </w:r>
+    </w:p>
+    <w:bookmarkStart w:id="32" w:name="câu-hỏi-gốc"/>
     <w:p>
       <w:pPr>
         <w:pStyle w:val="Heading3"/>
       </w:pPr>
       <w:r>
-        <w:t xml:space="preserve">Câu 4 [MID+] — Pod OOMKilled</w:t>
+        <w:t xml:space="preserve">Câu hỏi gốc</w:t>
       </w:r>
     </w:p>
     <w:p>
@@ -4584,61 +4686,1274 @@
         <w:pStyle w:val="BlockText"/>
       </w:pPr>
       <w:r>
-        <w:t xml:space="preserve">Pod app</w:t>
-      </w:r>
-      <w:r>
-        <w:t xml:space="preserve"> </w:t>
-      </w:r>
-      <w:r>
-        <w:rPr>
-          <w:rStyle w:val="VerbatimChar"/>
-        </w:rPr>
-        <w:t xml:space="preserve">orders-prd</w:t>
-      </w:r>
-      <w:r>
-        <w:t xml:space="preserve"> </w:t>
-      </w:r>
-      <w:r>
-        <w:t xml:space="preserve">đang chạy ổn 2 tuần. Đêm qua deploy version mới, sáng anh thấy pod restart 12 lần,</w:t>
-      </w:r>
-      <w:r>
-        <w:t xml:space="preserve"> </w:t>
-      </w:r>
-      <w:r>
-        <w:rPr>
-          <w:rStyle w:val="VerbatimChar"/>
-        </w:rPr>
-        <w:t xml:space="preserve">RESTARTS=12</w:t>
+        <w:t xml:space="preserve">Em là tech lead. CEO yêu cầu launch site flash sale</w:t>
+      </w:r>
+      <w:r>
+        <w:t xml:space="preserve"> </w:t>
+      </w:r>
+      <w:r>
+        <w:rPr>
+          <w:b/>
+          <w:bCs/>
+        </w:rPr>
+        <w:t xml:space="preserve">12.12</w:t>
+      </w:r>
+      <w:r>
+        <w:t xml:space="preserve"> </w:t>
+      </w:r>
+      <w:r>
+        <w:t xml:space="preserve">next month. Hiện tại site multi-AZ Singapore, peak 1K rps avg. Đợt 12.12 dự kiến</w:t>
+      </w:r>
+      <w:r>
+        <w:t xml:space="preserve"> </w:t>
+      </w:r>
+      <w:r>
+        <w:rPr>
+          <w:b/>
+          <w:bCs/>
+        </w:rPr>
+        <w:t xml:space="preserve">peak 10K rps</w:t>
+      </w:r>
+      <w:r>
+        <w:t xml:space="preserve"> </w:t>
+      </w:r>
+      <w:r>
+        <w:t xml:space="preserve">trong 2h. Em design như nào? Multi-AZ scale lên có đủ chưa, hay phải multi-region? Cost vs SLA trade-off thế nào?</w:t>
+      </w:r>
+    </w:p>
+    <w:bookmarkEnd w:id="32"/>
+    <w:bookmarkStart w:id="33" w:name="user-context"/>
+    <w:p>
+      <w:pPr>
+        <w:pStyle w:val="Heading3"/>
+      </w:pPr>
+      <w:r>
+        <w:t xml:space="preserve">User context</w:t>
+      </w:r>
+    </w:p>
+    <w:p>
+      <w:pPr>
+        <w:pStyle w:val="FirstParagraph"/>
+      </w:pPr>
+      <w:r>
+        <w:t xml:space="preserve">User chưa từng làm system design → yêu cầu em demo + dạy framework</w:t>
+      </w:r>
+      <w:r>
+        <w:t xml:space="preserve"> </w:t>
+      </w:r>
+      <w:r>
+        <w:t xml:space="preserve">“tính toán làm sao”</w:t>
       </w:r>
       <w:r>
         <w:t xml:space="preserve">.</w:t>
       </w:r>
-      <w:r>
-        <w:t xml:space="preserve"> </w:t>
-      </w:r>
-      <w:r>
-        <w:rPr>
-          <w:rStyle w:val="VerbatimChar"/>
-        </w:rPr>
-        <w:t xml:space="preserve">kubectl describe</w:t>
-      </w:r>
-      <w:r>
-        <w:t xml:space="preserve"> </w:t>
-      </w:r>
-      <w:r>
-        <w:t xml:space="preserve">thấy</w:t>
-      </w:r>
-      <w:r>
-        <w:t xml:space="preserve"> </w:t>
-      </w:r>
-      <w:r>
-        <w:rPr>
-          <w:rStyle w:val="VerbatimChar"/>
-        </w:rPr>
-        <w:t xml:space="preserve">Last State: Terminated, Reason: OOMKilled, Exit Code: 137</w:t>
-      </w:r>
-      <w:r>
-        <w:t xml:space="preserve">. Anh:</w:t>
+    </w:p>
+    <w:p>
+      <w:r>
+        <w:pict>
+          <v:rect style="width:0;height:1.5pt" o:hralign="center" o:hrstd="t" o:hr="t"/>
+        </w:pict>
+      </w:r>
+    </w:p>
+    <w:bookmarkEnd w:id="33"/>
+    <w:bookmarkStart w:id="34" w:name="X35946f745494ce7b4d2217aba9d4f3a3a63512b"/>
+    <w:p>
+      <w:pPr>
+        <w:pStyle w:val="Heading3"/>
+      </w:pPr>
+      <w:r>
+        <w:t xml:space="preserve">Framework RESHADED — 5 step cho 45 phút interview</w:t>
+      </w:r>
+    </w:p>
+    <w:tbl>
+      <w:tblPr>
+        <w:tblStyle w:val="Table"/>
+        <w:tblW w:type="pct" w:w="5000"/>
+        <w:tblLayout w:type="fixed"/>
+        <w:tblLook w:firstRow="1" w:lastRow="0" w:firstColumn="0" w:lastColumn="0" w:noHBand="0" w:noVBand="0" w:val="0020"/>
+      </w:tblPr>
+      <w:tblGrid>
+        <w:gridCol w:w="1980"/>
+        <w:gridCol w:w="1980"/>
+        <w:gridCol w:w="1980"/>
+        <w:gridCol w:w="1980"/>
+      </w:tblGrid>
+      <w:tr>
+        <w:trPr>
+          <w:tblHeader w:val="on"/>
+        </w:trPr>
+        <w:tc>
+          <w:tcPr/>
+          <w:p>
+            <w:pPr>
+              <w:pStyle w:val="Compact"/>
+            </w:pPr>
+            <w:r>
+              <w:t xml:space="preserve">Step</w:t>
+            </w:r>
+          </w:p>
+        </w:tc>
+        <w:tc>
+          <w:tcPr/>
+          <w:p>
+            <w:pPr>
+              <w:pStyle w:val="Compact"/>
+            </w:pPr>
+            <w:r>
+              <w:t xml:space="preserve">Tên</w:t>
+            </w:r>
+          </w:p>
+        </w:tc>
+        <w:tc>
+          <w:tcPr/>
+          <w:p>
+            <w:pPr>
+              <w:pStyle w:val="Compact"/>
+            </w:pPr>
+            <w:r>
+              <w:t xml:space="preserve">Thời gian</w:t>
+            </w:r>
+          </w:p>
+        </w:tc>
+        <w:tc>
+          <w:tcPr/>
+          <w:p>
+            <w:pPr>
+              <w:pStyle w:val="Compact"/>
+            </w:pPr>
+            <w:r>
+              <w:t xml:space="preserve">Mục tiêu</w:t>
+            </w:r>
+          </w:p>
+        </w:tc>
+      </w:tr>
+      <w:tr>
+        <w:tc>
+          <w:tcPr/>
+          <w:p>
+            <w:pPr>
+              <w:pStyle w:val="Compact"/>
+            </w:pPr>
+            <w:r>
+              <w:t xml:space="preserve">1</w:t>
+            </w:r>
+          </w:p>
+        </w:tc>
+        <w:tc>
+          <w:tcPr/>
+          <w:p>
+            <w:pPr>
+              <w:pStyle w:val="Compact"/>
+            </w:pPr>
+            <w:r>
+              <w:rPr>
+                <w:b/>
+                <w:bCs/>
+              </w:rPr>
+              <w:t xml:space="preserve">CLARIFY</w:t>
+            </w:r>
+          </w:p>
+        </w:tc>
+        <w:tc>
+          <w:tcPr/>
+          <w:p>
+            <w:pPr>
+              <w:pStyle w:val="Compact"/>
+            </w:pPr>
+            <w:r>
+              <w:t xml:space="preserve">5 min</w:t>
+            </w:r>
+          </w:p>
+        </w:tc>
+        <w:tc>
+          <w:tcPr/>
+          <w:p>
+            <w:pPr>
+              <w:pStyle w:val="Compact"/>
+            </w:pPr>
+            <w:r>
+              <w:t xml:space="preserve">Hỏi requirements (FR + NFR) — KHÔNG nhảy vào design ngay</w:t>
+            </w:r>
+          </w:p>
+        </w:tc>
+      </w:tr>
+      <w:tr>
+        <w:tc>
+          <w:tcPr/>
+          <w:p>
+            <w:pPr>
+              <w:pStyle w:val="Compact"/>
+            </w:pPr>
+            <w:r>
+              <w:t xml:space="preserve">2</w:t>
+            </w:r>
+          </w:p>
+        </w:tc>
+        <w:tc>
+          <w:tcPr/>
+          <w:p>
+            <w:pPr>
+              <w:pStyle w:val="Compact"/>
+            </w:pPr>
+            <w:r>
+              <w:rPr>
+                <w:b/>
+                <w:bCs/>
+              </w:rPr>
+              <w:t xml:space="preserve">ESTIMATE</w:t>
+            </w:r>
+          </w:p>
+        </w:tc>
+        <w:tc>
+          <w:tcPr/>
+          <w:p>
+            <w:pPr>
+              <w:pStyle w:val="Compact"/>
+            </w:pPr>
+            <w:r>
+              <w:t xml:space="preserve">10 min</w:t>
+            </w:r>
+          </w:p>
+        </w:tc>
+        <w:tc>
+          <w:tcPr/>
+          <w:p>
+            <w:pPr>
+              <w:pStyle w:val="Compact"/>
+            </w:pPr>
+            <w:r>
+              <w:t xml:space="preserve">Tính capacity: traffic, compute, DB, cache, BW</w:t>
+            </w:r>
+          </w:p>
+        </w:tc>
+      </w:tr>
+      <w:tr>
+        <w:tc>
+          <w:tcPr/>
+          <w:p>
+            <w:pPr>
+              <w:pStyle w:val="Compact"/>
+            </w:pPr>
+            <w:r>
+              <w:t xml:space="preserve">3</w:t>
+            </w:r>
+          </w:p>
+        </w:tc>
+        <w:tc>
+          <w:tcPr/>
+          <w:p>
+            <w:pPr>
+              <w:pStyle w:val="Compact"/>
+            </w:pPr>
+            <w:r>
+              <w:rPr>
+                <w:b/>
+                <w:bCs/>
+              </w:rPr>
+              <w:t xml:space="preserve">DESIGN</w:t>
+            </w:r>
+          </w:p>
+        </w:tc>
+        <w:tc>
+          <w:tcPr/>
+          <w:p>
+            <w:pPr>
+              <w:pStyle w:val="Compact"/>
+            </w:pPr>
+            <w:r>
+              <w:t xml:space="preserve">15 min</w:t>
+            </w:r>
+          </w:p>
+        </w:tc>
+        <w:tc>
+          <w:tcPr/>
+          <w:p>
+            <w:pPr>
+              <w:pStyle w:val="Compact"/>
+            </w:pPr>
+            <w:r>
+              <w:t xml:space="preserve">Boxes &amp; arrows architecture cấp cao</w:t>
+            </w:r>
+          </w:p>
+        </w:tc>
+      </w:tr>
+      <w:tr>
+        <w:tc>
+          <w:tcPr/>
+          <w:p>
+            <w:pPr>
+              <w:pStyle w:val="Compact"/>
+            </w:pPr>
+            <w:r>
+              <w:t xml:space="preserve">4</w:t>
+            </w:r>
+          </w:p>
+        </w:tc>
+        <w:tc>
+          <w:tcPr/>
+          <w:p>
+            <w:pPr>
+              <w:pStyle w:val="Compact"/>
+            </w:pPr>
+            <w:r>
+              <w:rPr>
+                <w:b/>
+                <w:bCs/>
+              </w:rPr>
+              <w:t xml:space="preserve">DEEP DIVE</w:t>
+            </w:r>
+          </w:p>
+        </w:tc>
+        <w:tc>
+          <w:tcPr/>
+          <w:p>
+            <w:pPr>
+              <w:pStyle w:val="Compact"/>
+            </w:pPr>
+            <w:r>
+              <w:t xml:space="preserve">10 min</w:t>
+            </w:r>
+          </w:p>
+        </w:tc>
+        <w:tc>
+          <w:tcPr/>
+          <w:p>
+            <w:pPr>
+              <w:pStyle w:val="Compact"/>
+            </w:pPr>
+            <w:r>
+              <w:t xml:space="preserve">Bottleneck + scaling pattern</w:t>
+            </w:r>
+          </w:p>
+        </w:tc>
+      </w:tr>
+      <w:tr>
+        <w:tc>
+          <w:tcPr/>
+          <w:p>
+            <w:pPr>
+              <w:pStyle w:val="Compact"/>
+            </w:pPr>
+            <w:r>
+              <w:t xml:space="preserve">5</w:t>
+            </w:r>
+          </w:p>
+        </w:tc>
+        <w:tc>
+          <w:tcPr/>
+          <w:p>
+            <w:pPr>
+              <w:pStyle w:val="Compact"/>
+            </w:pPr>
+            <w:r>
+              <w:rPr>
+                <w:b/>
+                <w:bCs/>
+              </w:rPr>
+              <w:t xml:space="preserve">TRADE-OFF</w:t>
+            </w:r>
+          </w:p>
+        </w:tc>
+        <w:tc>
+          <w:tcPr/>
+          <w:p>
+            <w:pPr>
+              <w:pStyle w:val="Compact"/>
+            </w:pPr>
+            <w:r>
+              <w:t xml:space="preserve">5 min</w:t>
+            </w:r>
+          </w:p>
+        </w:tc>
+        <w:tc>
+          <w:tcPr/>
+          <w:p>
+            <w:pPr>
+              <w:pStyle w:val="Compact"/>
+            </w:pPr>
+            <w:r>
+              <w:t xml:space="preserve">Trả lời CEO: multi-AZ vs multi-region</w:t>
+            </w:r>
+          </w:p>
+        </w:tc>
+      </w:tr>
+    </w:tbl>
+    <w:p>
+      <w:pPr>
+        <w:pStyle w:val="BodyText"/>
+      </w:pPr>
+      <w:r>
+        <w:rPr>
+          <w:b/>
+          <w:bCs/>
+        </w:rPr>
+        <w:t xml:space="preserve">Vàng</w:t>
+      </w:r>
+      <w:r>
+        <w:t xml:space="preserve">: Senior fail thường vì</w:t>
+      </w:r>
+      <w:r>
+        <w:t xml:space="preserve"> </w:t>
+      </w:r>
+      <w:r>
+        <w:rPr>
+          <w:b/>
+          <w:bCs/>
+        </w:rPr>
+        <w:t xml:space="preserve">bỏ qua Step 1 CLARIFY</w:t>
+      </w:r>
+      <w:r>
+        <w:t xml:space="preserve"> </w:t>
+      </w:r>
+      <w:r>
+        <w:t xml:space="preserve">→ design dựa trên giả định sai. Hỏi requirements trước = signal cho interviewer</w:t>
+      </w:r>
+      <w:r>
+        <w:t xml:space="preserve"> </w:t>
+      </w:r>
+      <w:r>
+        <w:t xml:space="preserve">“anh có suy nghĩ production”</w:t>
+      </w:r>
+      <w:r>
+        <w:t xml:space="preserve">.</w:t>
+      </w:r>
+    </w:p>
+    <w:p>
+      <w:r>
+        <w:pict>
+          <v:rect style="width:0;height:1.5pt" o:hralign="center" o:hrstd="t" o:hr="t"/>
+        </w:pict>
+      </w:r>
+    </w:p>
+    <w:bookmarkEnd w:id="34"/>
+    <w:bookmarkStart w:id="35" w:name="step-1-clarify-5-phút"/>
+    <w:p>
+      <w:pPr>
+        <w:pStyle w:val="Heading3"/>
+      </w:pPr>
+      <w:r>
+        <w:t xml:space="preserve">Step 1 — CLARIFY (5 phút)</w:t>
+      </w:r>
+    </w:p>
+    <w:p>
+      <w:pPr>
+        <w:pStyle w:val="FirstParagraph"/>
+      </w:pPr>
+      <w:r>
+        <w:rPr>
+          <w:b/>
+          <w:bCs/>
+        </w:rPr>
+        <w:t xml:space="preserve">FR (Functional Requirements)</w:t>
+      </w:r>
+      <w:r>
+        <w:t xml:space="preserve"> </w:t>
+      </w:r>
+      <w:r>
+        <w:t xml:space="preserve">— chức năng PHẢI có:</w:t>
+      </w:r>
+      <w:r>
+        <w:t xml:space="preserve"> </w:t>
+      </w:r>
+      <w:r>
+        <w:t xml:space="preserve">1. Browse product (catalog read)</w:t>
+      </w:r>
+      <w:r>
+        <w:t xml:space="preserve"> </w:t>
+      </w:r>
+      <w:r>
+        <w:t xml:space="preserve">2. Add to cart</w:t>
+      </w:r>
+      <w:r>
+        <w:t xml:space="preserve"> </w:t>
+      </w:r>
+      <w:r>
+        <w:t xml:space="preserve">3. Checkout (payment + order)</w:t>
+      </w:r>
+      <w:r>
+        <w:t xml:space="preserve"> </w:t>
+      </w:r>
+      <w:r>
+        <w:t xml:space="preserve">4. Order tracking</w:t>
+      </w:r>
+      <w:r>
+        <w:t xml:space="preserve"> </w:t>
+      </w:r>
+      <w:r>
+        <w:t xml:space="preserve">5. (Optional) review, recommendation</w:t>
+      </w:r>
+    </w:p>
+    <w:p>
+      <w:pPr>
+        <w:pStyle w:val="BodyText"/>
+      </w:pPr>
+      <w:r>
+        <w:rPr>
+          <w:b/>
+          <w:bCs/>
+        </w:rPr>
+        <w:t xml:space="preserve">NFR (Non-Functional Requirements)</w:t>
+      </w:r>
+      <w:r>
+        <w:t xml:space="preserve"> </w:t>
+      </w:r>
+      <w:r>
+        <w:t xml:space="preserve">— chất lượng:</w:t>
+      </w:r>
+      <w:r>
+        <w:t xml:space="preserve"> </w:t>
+      </w:r>
+      <w:r>
+        <w:t xml:space="preserve">6. Peak rps + ratio peak/avg</w:t>
+      </w:r>
+      <w:r>
+        <w:t xml:space="preserve"> </w:t>
+      </w:r>
+      <w:r>
+        <w:t xml:space="preserve">7. Latency P95/P99</w:t>
+      </w:r>
+      <w:r>
+        <w:t xml:space="preserve"> </w:t>
+      </w:r>
+      <w:r>
+        <w:t xml:space="preserve">8. SLA, RPO, RTO</w:t>
+      </w:r>
+    </w:p>
+    <w:p>
+      <w:pPr>
+        <w:pStyle w:val="BodyText"/>
+      </w:pPr>
+      <w:r>
+        <w:rPr>
+          <w:b/>
+          <w:bCs/>
+        </w:rPr>
+        <w:t xml:space="preserve">Đáp án giả định cho 12.12 flash sale</w:t>
+      </w:r>
+      <w:r>
+        <w:t xml:space="preserve">:</w:t>
+      </w:r>
+    </w:p>
+    <w:tbl>
+      <w:tblPr>
+        <w:tblStyle w:val="Table"/>
+        <w:tblW w:type="pct" w:w="5000"/>
+        <w:tblLayout w:type="fixed"/>
+        <w:tblLook w:firstRow="1" w:lastRow="0" w:firstColumn="0" w:lastColumn="0" w:noHBand="0" w:noVBand="0" w:val="0020"/>
+      </w:tblPr>
+      <w:tblGrid>
+        <w:gridCol w:w="2640"/>
+        <w:gridCol w:w="2640"/>
+        <w:gridCol w:w="2640"/>
+      </w:tblGrid>
+      <w:tr>
+        <w:trPr>
+          <w:tblHeader w:val="on"/>
+        </w:trPr>
+        <w:tc>
+          <w:tcPr/>
+          <w:p>
+            <w:pPr>
+              <w:pStyle w:val="Compact"/>
+            </w:pPr>
+            <w:r>
+              <w:t xml:space="preserve">NFR</w:t>
+            </w:r>
+          </w:p>
+        </w:tc>
+        <w:tc>
+          <w:tcPr/>
+          <w:p>
+            <w:pPr>
+              <w:pStyle w:val="Compact"/>
+            </w:pPr>
+            <w:r>
+              <w:t xml:space="preserve">Giá trị</w:t>
+            </w:r>
+          </w:p>
+        </w:tc>
+        <w:tc>
+          <w:tcPr/>
+          <w:p>
+            <w:pPr>
+              <w:pStyle w:val="Compact"/>
+            </w:pPr>
+            <w:r>
+              <w:t xml:space="preserve">Ý nghĩa</w:t>
+            </w:r>
+          </w:p>
+        </w:tc>
+      </w:tr>
+      <w:tr>
+        <w:tc>
+          <w:tcPr/>
+          <w:p>
+            <w:pPr>
+              <w:pStyle w:val="Compact"/>
+            </w:pPr>
+            <w:r>
+              <w:t xml:space="preserve">Peak rps</w:t>
+            </w:r>
+          </w:p>
+        </w:tc>
+        <w:tc>
+          <w:tcPr/>
+          <w:p>
+            <w:pPr>
+              <w:pStyle w:val="Compact"/>
+            </w:pPr>
+            <w:r>
+              <w:rPr>
+                <w:b/>
+                <w:bCs/>
+              </w:rPr>
+              <w:t xml:space="preserve">10K rps</w:t>
+            </w:r>
+            <w:r>
+              <w:t xml:space="preserve"> </w:t>
+            </w:r>
+            <w:r>
+              <w:t xml:space="preserve">(avg 1K, ratio</w:t>
+            </w:r>
+            <w:r>
+              <w:t xml:space="preserve"> </w:t>
+            </w:r>
+            <w:r>
+              <w:rPr>
+                <w:b/>
+                <w:bCs/>
+              </w:rPr>
+              <w:t xml:space="preserve">10x</w:t>
+            </w:r>
+            <w:r>
+              <w:t xml:space="preserve">)</w:t>
+            </w:r>
+          </w:p>
+        </w:tc>
+        <w:tc>
+          <w:tcPr/>
+          <w:p>
+            <w:pPr>
+              <w:pStyle w:val="Compact"/>
+            </w:pPr>
+            <w:r>
+              <w:t xml:space="preserve">Flash sale concentrate mua trong 2h</w:t>
+            </w:r>
+          </w:p>
+        </w:tc>
+      </w:tr>
+      <w:tr>
+        <w:tc>
+          <w:tcPr/>
+          <w:p>
+            <w:pPr>
+              <w:pStyle w:val="Compact"/>
+            </w:pPr>
+            <w:r>
+              <w:t xml:space="preserve">Read:Write</w:t>
+            </w:r>
+          </w:p>
+        </w:tc>
+        <w:tc>
+          <w:tcPr/>
+          <w:p>
+            <w:pPr>
+              <w:pStyle w:val="Compact"/>
+            </w:pPr>
+            <w:r>
+              <w:rPr>
+                <w:b/>
+                <w:bCs/>
+              </w:rPr>
+              <w:t xml:space="preserve">95:5</w:t>
+            </w:r>
+          </w:p>
+        </w:tc>
+        <w:tc>
+          <w:tcPr/>
+          <w:p>
+            <w:pPr>
+              <w:pStyle w:val="Compact"/>
+            </w:pPr>
+            <w:r>
+              <w:t xml:space="preserve">Browse &gt; checkout (typical e-commerce)</w:t>
+            </w:r>
+          </w:p>
+        </w:tc>
+      </w:tr>
+      <w:tr>
+        <w:tc>
+          <w:tcPr/>
+          <w:p>
+            <w:pPr>
+              <w:pStyle w:val="Compact"/>
+            </w:pPr>
+            <w:r>
+              <w:t xml:space="preserve">P95 latency</w:t>
+            </w:r>
+          </w:p>
+        </w:tc>
+        <w:tc>
+          <w:tcPr/>
+          <w:p>
+            <w:pPr>
+              <w:pStyle w:val="Compact"/>
+            </w:pPr>
+            <w:r>
+              <w:t xml:space="preserve">&lt;</w:t>
+            </w:r>
+            <w:r>
+              <w:t xml:space="preserve"> </w:t>
+            </w:r>
+            <w:r>
+              <w:rPr>
+                <w:b/>
+                <w:bCs/>
+              </w:rPr>
+              <w:t xml:space="preserve">300ms</w:t>
+            </w:r>
+            <w:r>
+              <w:t xml:space="preserve"> </w:t>
+            </w:r>
+            <w:r>
+              <w:t xml:space="preserve">browse, &lt;</w:t>
+            </w:r>
+            <w:r>
+              <w:t xml:space="preserve"> </w:t>
+            </w:r>
+            <w:r>
+              <w:rPr>
+                <w:b/>
+                <w:bCs/>
+              </w:rPr>
+              <w:t xml:space="preserve">1s</w:t>
+            </w:r>
+            <w:r>
+              <w:t xml:space="preserve"> </w:t>
+            </w:r>
+            <w:r>
+              <w:t xml:space="preserve">checkout</w:t>
+            </w:r>
+          </w:p>
+        </w:tc>
+        <w:tc>
+          <w:tcPr/>
+          <w:p>
+            <w:pPr>
+              <w:pStyle w:val="Compact"/>
+            </w:pPr>
+            <w:r>
+              <w:t xml:space="preserve">95% request dưới ngưỡng</w:t>
+            </w:r>
+          </w:p>
+        </w:tc>
+      </w:tr>
+      <w:tr>
+        <w:tc>
+          <w:tcPr/>
+          <w:p>
+            <w:pPr>
+              <w:pStyle w:val="Compact"/>
+            </w:pPr>
+            <w:r>
+              <w:t xml:space="preserve">SLA</w:t>
+            </w:r>
+          </w:p>
+        </w:tc>
+        <w:tc>
+          <w:tcPr/>
+          <w:p>
+            <w:pPr>
+              <w:pStyle w:val="Compact"/>
+            </w:pPr>
+            <w:r>
+              <w:rPr>
+                <w:b/>
+                <w:bCs/>
+              </w:rPr>
+              <w:t xml:space="preserve">99.95%</w:t>
+            </w:r>
+            <w:r>
+              <w:t xml:space="preserve"> </w:t>
+            </w:r>
+            <w:r>
+              <w:t xml:space="preserve">toàn site, checkout ưu tiên hơn</w:t>
+            </w:r>
+          </w:p>
+        </w:tc>
+        <w:tc>
+          <w:tcPr/>
+          <w:p>
+            <w:pPr>
+              <w:pStyle w:val="Compact"/>
+            </w:pPr>
+            <w:r>
+              <w:t xml:space="preserve">Downtime ≤4.38h/năm</w:t>
+            </w:r>
+          </w:p>
+        </w:tc>
+      </w:tr>
+      <w:tr>
+        <w:tc>
+          <w:tcPr/>
+          <w:p>
+            <w:pPr>
+              <w:pStyle w:val="Compact"/>
+            </w:pPr>
+            <w:r>
+              <w:t xml:space="preserve">RPO order</w:t>
+            </w:r>
+          </w:p>
+        </w:tc>
+        <w:tc>
+          <w:tcPr/>
+          <w:p>
+            <w:pPr>
+              <w:pStyle w:val="Compact"/>
+            </w:pPr>
+            <w:r>
+              <w:rPr>
+                <w:b/>
+                <w:bCs/>
+              </w:rPr>
+              <w:t xml:space="preserve">= 0</w:t>
+            </w:r>
+          </w:p>
+        </w:tc>
+        <w:tc>
+          <w:tcPr/>
+          <w:p>
+            <w:pPr>
+              <w:pStyle w:val="Compact"/>
+            </w:pPr>
+            <w:r>
+              <w:t xml:space="preserve">Mất 1 đơn = mất tiền + uy tín</w:t>
+            </w:r>
+          </w:p>
+        </w:tc>
+      </w:tr>
+    </w:tbl>
+    <w:p>
+      <w:r>
+        <w:pict>
+          <v:rect style="width:0;height:1.5pt" o:hralign="center" o:hrstd="t" o:hr="t"/>
+        </w:pict>
+      </w:r>
+    </w:p>
+    <w:bookmarkEnd w:id="35"/>
+    <w:bookmarkStart w:id="36" w:name="Xa67c921d618f39288fa2f128d2071d2a59672b0"/>
+    <w:p>
+      <w:pPr>
+        <w:pStyle w:val="Heading3"/>
+      </w:pPr>
+      <w:r>
+        <w:t xml:space="preserve">Step 1.5 — Giải thích thuật ngữ (user push back)</w:t>
+      </w:r>
+    </w:p>
+    <w:p>
+      <w:pPr>
+        <w:pStyle w:val="FirstParagraph"/>
+      </w:pPr>
+      <w:r>
+        <w:rPr>
+          <w:b/>
+          <w:bCs/>
+        </w:rPr>
+        <w:t xml:space="preserve">Peak rps</w:t>
+      </w:r>
+      <w:r>
+        <w:t xml:space="preserve"> </w:t>
+      </w:r>
+      <w:r>
+        <w:t xml:space="preserve">&gt; Peak = đỉnh trong khoảng thời gian ngắn (giây/phút). Avg = trung bình cả ngày. Ratio peak/avg quyết định bạn provision theo đâu. Flash sale ratio 10x = phải scale cho 10K dù avg chỉ 1K, nếu không sập.</w:t>
+      </w:r>
+    </w:p>
+    <w:p>
+      <w:pPr>
+        <w:pStyle w:val="BodyText"/>
+      </w:pPr>
+      <w:r>
+        <w:rPr>
+          <w:b/>
+          <w:bCs/>
+        </w:rPr>
+        <w:t xml:space="preserve">P95 latency &lt; 300ms</w:t>
+      </w:r>
+      <w:r>
+        <w:t xml:space="preserve"> </w:t>
+      </w:r>
+      <w:r>
+        <w:t xml:space="preserve">&gt; 95% request trả về dưới 300ms. KHÔNG dùng avg vì avg ẩn long-tail. Ví dụ: 95 request 100ms + 5 request 5s → avg 345ms (đẹp), nhưng P95 là 5s → 5% user thấy chậm.</w:t>
+      </w:r>
+      <w:r>
+        <w:t xml:space="preserve"> </w:t>
+      </w:r>
+      <w:r>
+        <w:t xml:space="preserve">&gt;</w:t>
+      </w:r>
+      <w:r>
+        <w:t xml:space="preserve"> </w:t>
+      </w:r>
+      <w:r>
+        <w:t xml:space="preserve">&gt; Long-tail nguyên nhân: GC pause Java, DB lock contention, TCP retransmit, cold start.</w:t>
+      </w:r>
+    </w:p>
+    <w:p>
+      <w:pPr>
+        <w:pStyle w:val="BodyText"/>
+      </w:pPr>
+      <w:r>
+        <w:rPr>
+          <w:b/>
+          <w:bCs/>
+        </w:rPr>
+        <w:t xml:space="preserve">SLA</w:t>
+      </w:r>
+      <w:r>
+        <w:rPr>
+          <w:b/>
+          <w:bCs/>
+        </w:rPr>
+        <w:t xml:space="preserve"> </w:t>
+      </w:r>
+      <w:r>
+        <w:rPr>
+          <w:b/>
+          <w:bCs/>
+        </w:rPr>
+        <w:t xml:space="preserve">“số 9”</w:t>
+      </w:r>
+      <w:r>
+        <w:t xml:space="preserve"> </w:t>
+      </w:r>
+      <w:r>
+        <w:t xml:space="preserve">(Senior phải thuộc):</w:t>
+      </w:r>
+    </w:p>
+    <w:tbl>
+      <w:tblPr>
+        <w:tblStyle w:val="Table"/>
+        <w:tblW w:type="auto" w:w="0"/>
+        <w:tblLook w:firstRow="1" w:lastRow="0" w:firstColumn="0" w:lastColumn="0" w:noHBand="0" w:noVBand="0" w:val="0020"/>
+      </w:tblPr>
+      <w:tblGrid>
+        <w:gridCol w:w="3960"/>
+        <w:gridCol w:w="3960"/>
+      </w:tblGrid>
+      <w:tr>
+        <w:trPr>
+          <w:tblHeader w:val="on"/>
+        </w:trPr>
+        <w:tc>
+          <w:tcPr/>
+          <w:p>
+            <w:pPr>
+              <w:pStyle w:val="Compact"/>
+            </w:pPr>
+            <w:r>
+              <w:t xml:space="preserve">SLA</w:t>
+            </w:r>
+          </w:p>
+        </w:tc>
+        <w:tc>
+          <w:tcPr/>
+          <w:p>
+            <w:pPr>
+              <w:pStyle w:val="Compact"/>
+            </w:pPr>
+            <w:r>
+              <w:t xml:space="preserve">Downtime/năm</w:t>
+            </w:r>
+          </w:p>
+        </w:tc>
+      </w:tr>
+      <w:tr>
+        <w:tc>
+          <w:tcPr/>
+          <w:p>
+            <w:pPr>
+              <w:pStyle w:val="Compact"/>
+            </w:pPr>
+            <w:r>
+              <w:t xml:space="preserve">99%</w:t>
+            </w:r>
+          </w:p>
+        </w:tc>
+        <w:tc>
+          <w:tcPr/>
+          <w:p>
+            <w:pPr>
+              <w:pStyle w:val="Compact"/>
+            </w:pPr>
+            <w:r>
+              <w:t xml:space="preserve">3.65 ngày</w:t>
+            </w:r>
+          </w:p>
+        </w:tc>
+      </w:tr>
+      <w:tr>
+        <w:tc>
+          <w:tcPr/>
+          <w:p>
+            <w:pPr>
+              <w:pStyle w:val="Compact"/>
+            </w:pPr>
+            <w:r>
+              <w:t xml:space="preserve">99.9% (three 9)</w:t>
+            </w:r>
+          </w:p>
+        </w:tc>
+        <w:tc>
+          <w:tcPr/>
+          <w:p>
+            <w:pPr>
+              <w:pStyle w:val="Compact"/>
+            </w:pPr>
+            <w:r>
+              <w:t xml:space="preserve">8.76 giờ</w:t>
+            </w:r>
+          </w:p>
+        </w:tc>
+      </w:tr>
+      <w:tr>
+        <w:tc>
+          <w:tcPr/>
+          <w:p>
+            <w:pPr>
+              <w:pStyle w:val="Compact"/>
+            </w:pPr>
+            <w:r>
+              <w:rPr>
+                <w:b/>
+                <w:bCs/>
+              </w:rPr>
+              <w:t xml:space="preserve">99.95%</w:t>
+            </w:r>
+          </w:p>
+        </w:tc>
+        <w:tc>
+          <w:tcPr/>
+          <w:p>
+            <w:pPr>
+              <w:pStyle w:val="Compact"/>
+            </w:pPr>
+            <w:r>
+              <w:t xml:space="preserve">4.38 giờ</w:t>
+            </w:r>
+          </w:p>
+        </w:tc>
+      </w:tr>
+      <w:tr>
+        <w:tc>
+          <w:tcPr/>
+          <w:p>
+            <w:pPr>
+              <w:pStyle w:val="Compact"/>
+            </w:pPr>
+            <w:r>
+              <w:t xml:space="preserve">99.99% (four 9)</w:t>
+            </w:r>
+          </w:p>
+        </w:tc>
+        <w:tc>
+          <w:tcPr/>
+          <w:p>
+            <w:pPr>
+              <w:pStyle w:val="Compact"/>
+            </w:pPr>
+            <w:r>
+              <w:t xml:space="preserve">52 phút</w:t>
+            </w:r>
+          </w:p>
+        </w:tc>
+      </w:tr>
+      <w:tr>
+        <w:tc>
+          <w:tcPr/>
+          <w:p>
+            <w:pPr>
+              <w:pStyle w:val="Compact"/>
+            </w:pPr>
+            <w:r>
+              <w:t xml:space="preserve">99.999% (five 9)</w:t>
+            </w:r>
+          </w:p>
+        </w:tc>
+        <w:tc>
+          <w:tcPr/>
+          <w:p>
+            <w:pPr>
+              <w:pStyle w:val="Compact"/>
+            </w:pPr>
+            <w:r>
+              <w:t xml:space="preserve">5.26 phút</w:t>
+            </w:r>
+          </w:p>
+        </w:tc>
+      </w:tr>
+    </w:tbl>
+    <w:p>
+      <w:pPr>
+        <w:pStyle w:val="BodyText"/>
+      </w:pPr>
+      <w:r>
+        <w:rPr>
+          <w:b/>
+          <w:bCs/>
+        </w:rPr>
+        <w:t xml:space="preserve">SLA chuỗi</w:t>
+      </w:r>
+      <w:r>
+        <w:t xml:space="preserve"> </w:t>
+      </w:r>
+      <w:r>
+        <w:t xml:space="preserve">(weakest link):</w:t>
+      </w:r>
+    </w:p>
+    <w:p>
+      <w:pPr>
+        <w:pStyle w:val="SourceCode"/>
+      </w:pPr>
+      <w:r>
+        <w:rPr>
+          <w:rStyle w:val="VerbatimChar"/>
+        </w:rPr>
+        <w:t xml:space="preserve">5 service × SLA 99.9% mỗi cái</w:t>
+      </w:r>
+      <w:r>
+        <w:br/>
+      </w:r>
+      <w:r>
+        <w:rPr>
+          <w:rStyle w:val="VerbatimChar"/>
+        </w:rPr>
+        <w:t xml:space="preserve">Site SLA = 0.999^5 = 0.995 = 99.5%</w:t>
+      </w:r>
+      <w:r>
+        <w:br/>
+      </w:r>
+      <w:r>
+        <w:rPr>
+          <w:rStyle w:val="VerbatimChar"/>
+        </w:rPr>
+        <w:t xml:space="preserve">→ Mất 0.4% chỉ vì có nhiều service nối tiếp</w:t>
+      </w:r>
+    </w:p>
+    <w:p>
+      <w:pPr>
+        <w:pStyle w:val="FirstParagraph"/>
+      </w:pPr>
+      <w:r>
+        <w:t xml:space="preserve">→ Decouple critical path: checkout chỉ phụ thuộc 2 service (auth + payment), không 5.</w:t>
+      </w:r>
+    </w:p>
+    <w:p>
+      <w:pPr>
+        <w:pStyle w:val="BodyText"/>
+      </w:pPr>
+      <w:r>
+        <w:rPr>
+          <w:b/>
+          <w:bCs/>
+        </w:rPr>
+        <w:t xml:space="preserve">RPO = Recovery Point Objective</w:t>
+      </w:r>
+      <w:r>
+        <w:t xml:space="preserve"> </w:t>
+      </w:r>
+      <w:r>
+        <w:t xml:space="preserve">&gt; Mất tối đa bao nhiêu phút data khi disaster. RPO = 0 = sync replication (Aurora multi-AZ commit cả 2 AZ trước khi return).</w:t>
+      </w:r>
+      <w:r>
+        <w:t xml:space="preserve"> </w:t>
+      </w:r>
+      <w:r>
+        <w:t xml:space="preserve">&gt; RPO = 5 phút = async backup (snapshot 5 phút/lần).</w:t>
+      </w:r>
+    </w:p>
+    <w:p>
+      <w:pPr>
+        <w:pStyle w:val="BodyText"/>
+      </w:pPr>
+      <w:r>
+        <w:rPr>
+          <w:b/>
+          <w:bCs/>
+        </w:rPr>
+        <w:t xml:space="preserve">RTO = Recovery Time Objective</w:t>
+      </w:r>
+      <w:r>
+        <w:t xml:space="preserve">: bao lâu để khôi phục. RTO 30 phút = chấp nhận sập 30 phút.</w:t>
+      </w:r>
+    </w:p>
+    <w:p>
+      <w:pPr>
+        <w:pStyle w:val="BodyText"/>
+      </w:pPr>
+      <w:r>
+        <w:rPr>
+          <w:b/>
+          <w:bCs/>
+        </w:rPr>
+        <w:t xml:space="preserve">100K SKU</w:t>
+      </w:r>
+      <w:r>
+        <w:t xml:space="preserve">: 100,000 sản phẩm (Stock Keeping Unit) trong catalog.</w:t>
+      </w:r>
+    </w:p>
+    <w:p>
+      <w:r>
+        <w:pict>
+          <v:rect style="width:0;height:1.5pt" o:hralign="center" o:hrstd="t" o:hr="t"/>
+        </w:pict>
+      </w:r>
+    </w:p>
+    <w:bookmarkEnd w:id="36"/>
+    <w:bookmarkStart w:id="42" w:name="step-2-estimate-10-phút"/>
+    <w:p>
+      <w:pPr>
+        <w:pStyle w:val="Heading3"/>
+      </w:pPr>
+      <w:r>
+        <w:t xml:space="preserve">Step 2 — ESTIMATE (10 phút)</w:t>
+      </w:r>
+    </w:p>
+    <w:bookmarkStart w:id="37" w:name="strategy-khi-không-có-production-number"/>
+    <w:p>
+      <w:pPr>
+        <w:pStyle w:val="Heading4"/>
+      </w:pPr>
+      <w:r>
+        <w:t xml:space="preserve">Strategy khi không có production number</w:t>
+      </w:r>
+    </w:p>
+    <w:p>
+      <w:pPr>
+        <w:pStyle w:val="FirstParagraph"/>
+      </w:pPr>
+      <w:r>
+        <w:t xml:space="preserve">User push back:</w:t>
+      </w:r>
+      <w:r>
+        <w:t xml:space="preserve"> </w:t>
+      </w:r>
+      <w:r>
+        <w:rPr>
+          <w:i/>
+          <w:iCs/>
+        </w:rPr>
+        <w:t xml:space="preserve">“mấy con số đó chưa làm bao giờ lấy đâu ra mà tính”</w:t>
+      </w:r>
+      <w:r>
+        <w:t xml:space="preserve">.</w:t>
+      </w:r>
+    </w:p>
+    <w:p>
+      <w:pPr>
+        <w:pStyle w:val="BodyText"/>
+      </w:pPr>
+      <w:r>
+        <w:t xml:space="preserve">3 cách defend Senior:</w:t>
       </w:r>
     </w:p>
     <w:p>
@@ -4650,22 +5965,26 @@
         </w:numPr>
       </w:pPr>
       <w:r>
-        <w:t xml:space="preserve">Tăng</w:t>
-      </w:r>
-      <w:r>
-        <w:t xml:space="preserve"> </w:t>
-      </w:r>
-      <w:r>
-        <w:rPr>
-          <w:rStyle w:val="VerbatimChar"/>
-        </w:rPr>
-        <w:t xml:space="preserve">resources.limits.memory</w:t>
-      </w:r>
-      <w:r>
-        <w:t xml:space="preserve"> </w:t>
-      </w:r>
-      <w:r>
-        <w:t xml:space="preserve">cho qua, hay tìm memory leak?</w:t>
+        <w:rPr>
+          <w:b/>
+          <w:bCs/>
+        </w:rPr>
+        <w:t xml:space="preserve">Hỏi interviewer back</w:t>
+      </w:r>
+      <w:r>
+        <w:t xml:space="preserve">:</w:t>
+      </w:r>
+      <w:r>
+        <w:t xml:space="preserve"> </w:t>
+      </w:r>
+      <w:r>
+        <w:t xml:space="preserve">“anh có production metric không, hay em assume?”</w:t>
+      </w:r>
+      <w:r>
+        <w:t xml:space="preserve"> </w:t>
+      </w:r>
+      <w:r>
+        <w:t xml:space="preserve">— signal có suy nghĩ data-driven.</w:t>
       </w:r>
     </w:p>
     <w:p>
@@ -4677,19 +5996,247 @@
         </w:numPr>
       </w:pPr>
       <w:r>
-        <w:t xml:space="preserve">Trade-off mỗi cách?</w:t>
-      </w:r>
-    </w:p>
+        <w:rPr>
+          <w:b/>
+          <w:bCs/>
+        </w:rPr>
+        <w:t xml:space="preserve">Memorize 5 anchor numbers</w:t>
+      </w:r>
+      <w:r>
+        <w:t xml:space="preserve"> </w:t>
+      </w:r>
+      <w:r>
+        <w:t xml:space="preserve">(thuộc lòng):</w:t>
+      </w:r>
+    </w:p>
+    <w:tbl>
+      <w:tblPr>
+        <w:tblStyle w:val="Table"/>
+        <w:tblW w:type="auto" w:w="0"/>
+        <w:tblLook w:firstRow="1" w:lastRow="0" w:firstColumn="0" w:lastColumn="0" w:noHBand="0" w:noVBand="0" w:val="0020"/>
+      </w:tblPr>
+      <w:tblGrid>
+        <w:gridCol w:w="3960"/>
+        <w:gridCol w:w="3960"/>
+      </w:tblGrid>
+      <w:tr>
+        <w:trPr>
+          <w:tblHeader w:val="on"/>
+        </w:trPr>
+        <w:tc>
+          <w:tcPr/>
+          <w:p>
+            <w:pPr>
+              <w:pStyle w:val="Compact"/>
+            </w:pPr>
+            <w:r>
+              <w:t xml:space="preserve">Resource</w:t>
+            </w:r>
+          </w:p>
+        </w:tc>
+        <w:tc>
+          <w:tcPr/>
+          <w:p>
+            <w:pPr>
+              <w:pStyle w:val="Compact"/>
+            </w:pPr>
+            <w:r>
+              <w:t xml:space="preserve">Anchor</w:t>
+            </w:r>
+          </w:p>
+        </w:tc>
+      </w:tr>
+      <w:tr>
+        <w:tc>
+          <w:tcPr/>
+          <w:p>
+            <w:pPr>
+              <w:pStyle w:val="Compact"/>
+            </w:pPr>
+            <w:r>
+              <w:t xml:space="preserve">1 pod Go/Java tuned</w:t>
+            </w:r>
+          </w:p>
+        </w:tc>
+        <w:tc>
+          <w:tcPr/>
+          <w:p>
+            <w:pPr>
+              <w:pStyle w:val="Compact"/>
+            </w:pPr>
+            <w:r>
+              <w:rPr>
+                <w:b/>
+                <w:bCs/>
+              </w:rPr>
+              <w:t xml:space="preserve">~500 rps</w:t>
+            </w:r>
+            <w:r>
+              <w:t xml:space="preserve"> </w:t>
+            </w:r>
+            <w:r>
+              <w:t xml:space="preserve">(P95 &lt; 300ms)</w:t>
+            </w:r>
+          </w:p>
+        </w:tc>
+      </w:tr>
+      <w:tr>
+        <w:tc>
+          <w:tcPr/>
+          <w:p>
+            <w:pPr>
+              <w:pStyle w:val="Compact"/>
+            </w:pPr>
+            <w:r>
+              <w:t xml:space="preserve">1 vCPU general workload</w:t>
+            </w:r>
+          </w:p>
+        </w:tc>
+        <w:tc>
+          <w:tcPr/>
+          <w:p>
+            <w:pPr>
+              <w:pStyle w:val="Compact"/>
+            </w:pPr>
+            <w:r>
+              <w:rPr>
+                <w:b/>
+                <w:bCs/>
+              </w:rPr>
+              <w:t xml:space="preserve">~1K rps</w:t>
+            </w:r>
+          </w:p>
+        </w:tc>
+      </w:tr>
+      <w:tr>
+        <w:tc>
+          <w:tcPr/>
+          <w:p>
+            <w:pPr>
+              <w:pStyle w:val="Compact"/>
+            </w:pPr>
+            <w:r>
+              <w:t xml:space="preserve">Aurora MySQL OLTP</w:t>
+            </w:r>
+          </w:p>
+        </w:tc>
+        <w:tc>
+          <w:tcPr/>
+          <w:p>
+            <w:pPr>
+              <w:pStyle w:val="Compact"/>
+            </w:pPr>
+            <w:r>
+              <w:rPr>
+                <w:b/>
+                <w:bCs/>
+              </w:rPr>
+              <w:t xml:space="preserve">~3K query/s</w:t>
+            </w:r>
+            <w:r>
+              <w:t xml:space="preserve"> </w:t>
+            </w:r>
+            <w:r>
+              <w:t xml:space="preserve">baseline</w:t>
+            </w:r>
+          </w:p>
+        </w:tc>
+      </w:tr>
+      <w:tr>
+        <w:tc>
+          <w:tcPr/>
+          <w:p>
+            <w:pPr>
+              <w:pStyle w:val="Compact"/>
+            </w:pPr>
+            <w:r>
+              <w:t xml:space="preserve">Redis ElastiCache</w:t>
+            </w:r>
+          </w:p>
+        </w:tc>
+        <w:tc>
+          <w:tcPr/>
+          <w:p>
+            <w:pPr>
+              <w:pStyle w:val="Compact"/>
+            </w:pPr>
+            <w:r>
+              <w:rPr>
+                <w:b/>
+                <w:bCs/>
+              </w:rPr>
+              <w:t xml:space="preserve">~100K ops/s</w:t>
+            </w:r>
+            <w:r>
+              <w:t xml:space="preserve"> </w:t>
+            </w:r>
+            <w:r>
+              <w:t xml:space="preserve">per shard</w:t>
+            </w:r>
+          </w:p>
+        </w:tc>
+      </w:tr>
+      <w:tr>
+        <w:tc>
+          <w:tcPr/>
+          <w:p>
+            <w:pPr>
+              <w:pStyle w:val="Compact"/>
+            </w:pPr>
+            <w:r>
+              <w:t xml:space="preserve">Kafka 1 broker</w:t>
+            </w:r>
+          </w:p>
+        </w:tc>
+        <w:tc>
+          <w:tcPr/>
+          <w:p>
+            <w:pPr>
+              <w:pStyle w:val="Compact"/>
+            </w:pPr>
+            <w:r>
+              <w:rPr>
+                <w:b/>
+                <w:bCs/>
+              </w:rPr>
+              <w:t xml:space="preserve">~100MB/s</w:t>
+            </w:r>
+            <w:r>
+              <w:t xml:space="preserve"> </w:t>
+            </w:r>
+            <w:r>
+              <w:t xml:space="preserve">throughput</w:t>
+            </w:r>
+          </w:p>
+        </w:tc>
+      </w:tr>
+    </w:tbl>
     <w:p>
       <w:pPr>
         <w:pStyle w:val="Compact"/>
         <w:numPr>
           <w:ilvl w:val="0"/>
-          <w:numId w:val="1003"/>
+          <w:numId w:val="1004"/>
         </w:numPr>
       </w:pPr>
       <w:r>
-        <w:t xml:space="preserve">Lệnh anh gõ trong 5 phút đầu để quyết định?</w:t>
+        <w:rPr>
+          <w:b/>
+          <w:bCs/>
+        </w:rPr>
+        <w:t xml:space="preserve">Defend by approach</w:t>
+      </w:r>
+      <w:r>
+        <w:t xml:space="preserve">:</w:t>
+      </w:r>
+      <w:r>
+        <w:t xml:space="preserve"> </w:t>
+      </w:r>
+      <w:r>
+        <w:t xml:space="preserve">“em sẽ benchmark trong staging với k6/locust, đo P95 tại CPU 60%, chia 1.5 lấy số an toàn”</w:t>
+      </w:r>
+      <w:r>
+        <w:t xml:space="preserve">.</w:t>
       </w:r>
     </w:p>
     <w:p>
@@ -4697,16 +6244,26 @@
         <w:pStyle w:val="FirstParagraph"/>
       </w:pPr>
       <w:r>
-        <w:t xml:space="preserve">→ Câu này test trade-off senior + tooling profiling (</w:t>
-      </w:r>
-      <w:r>
-        <w:rPr>
-          <w:rStyle w:val="VerbatimChar"/>
-        </w:rPr>
-        <w:t xml:space="preserve">kubectl top</w:t>
-      </w:r>
-      <w:r>
-        <w:t xml:space="preserve">, container metrics, heap dump).</w:t>
+        <w:rPr>
+          <w:b/>
+          <w:bCs/>
+        </w:rPr>
+        <w:t xml:space="preserve">Câu nói vàng trong interview</w:t>
+      </w:r>
+      <w:r>
+        <w:t xml:space="preserve">:</w:t>
+      </w:r>
+      <w:r>
+        <w:t xml:space="preserve"> </w:t>
+      </w:r>
+      <w:r>
+        <w:t xml:space="preserve">&gt;</w:t>
+      </w:r>
+      <w:r>
+        <w:t xml:space="preserve"> </w:t>
+      </w:r>
+      <w:r>
+        <w:t xml:space="preserve">“Em assume X dựa trên Y (Pareto / industry benchmark / anchor number), sẽ verify bằng Z (k6 load test / production metric / Grafana).”</w:t>
       </w:r>
     </w:p>
     <w:p>
@@ -4716,15 +6273,52 @@
         </w:pict>
       </w:r>
     </w:p>
-    <w:bookmarkEnd w:id="32"/>
-    <w:bookmarkEnd w:id="33"/>
-    <w:bookmarkStart w:id="34" w:name="cleanup-pending"/>
-    <w:p>
-      <w:pPr>
-        <w:pStyle w:val="Heading2"/>
-      </w:pPr>
-      <w:r>
-        <w:t xml:space="preserve">🧹 Cleanup pending</w:t>
+    <w:bookmarkEnd w:id="37"/>
+    <w:bookmarkStart w:id="38" w:name="tính-1-traffic-split"/>
+    <w:p>
+      <w:pPr>
+        <w:pStyle w:val="Heading4"/>
+      </w:pPr>
+      <w:r>
+        <w:t xml:space="preserve">Tính 1 — Traffic Split</w:t>
+      </w:r>
+    </w:p>
+    <w:p>
+      <w:pPr>
+        <w:pStyle w:val="SourceCode"/>
+      </w:pPr>
+      <w:r>
+        <w:rPr>
+          <w:rStyle w:val="VerbatimChar"/>
+        </w:rPr>
+        <w:t xml:space="preserve">Peak = 10,000 rps</w:t>
+      </w:r>
+      <w:r>
+        <w:br/>
+      </w:r>
+      <w:r>
+        <w:rPr>
+          <w:rStyle w:val="VerbatimChar"/>
+        </w:rPr>
+        <w:t xml:space="preserve">Read:Write = 95:5</w:t>
+      </w:r>
+      <w:r>
+        <w:br/>
+      </w:r>
+      <w:r>
+        <w:rPr>
+          <w:rStyle w:val="VerbatimChar"/>
+        </w:rPr>
+        <w:t xml:space="preserve">  → Read  = 9,500 rps</w:t>
+      </w:r>
+      <w:r>
+        <w:br/>
+      </w:r>
+      <w:r>
+        <w:rPr>
+          <w:rStyle w:val="VerbatimChar"/>
+        </w:rPr>
+        <w:t xml:space="preserve">  → Write =   500 rps</w:t>
       </w:r>
     </w:p>
     <w:p>
@@ -4732,36 +6326,117 @@
         <w:pStyle w:val="FirstParagraph"/>
       </w:pPr>
       <w:r>
-        <w:t xml:space="preserve">Pod giả lập còn live trên cluster (đến khi user delete):</w:t>
-      </w:r>
-    </w:p>
-    <w:p>
-      <w:pPr>
-        <w:pStyle w:val="SourceCode"/>
-      </w:pPr>
-      <w:r>
-        <w:rPr>
-          <w:rStyle w:val="ExtensionTok"/>
-        </w:rPr>
-        <w:t xml:space="preserve">kubectl</w:t>
-      </w:r>
-      <w:r>
-        <w:rPr>
-          <w:rStyle w:val="NormalTok"/>
-        </w:rPr>
-        <w:t xml:space="preserve"> delete pod crash-demo net-debug </w:t>
-      </w:r>
-      <w:r>
-        <w:rPr>
-          <w:rStyle w:val="AttributeTok"/>
-        </w:rPr>
-        <w:t xml:space="preserve">-n</w:t>
-      </w:r>
-      <w:r>
-        <w:rPr>
-          <w:rStyle w:val="NormalTok"/>
-        </w:rPr>
-        <w:t xml:space="preserve"> dev</w:t>
+        <w:rPr>
+          <w:b/>
+          <w:bCs/>
+        </w:rPr>
+        <w:t xml:space="preserve">Defend</w:t>
+      </w:r>
+      <w:r>
+        <w:rPr>
+          <w:b/>
+          <w:bCs/>
+        </w:rPr>
+        <w:t xml:space="preserve"> </w:t>
+      </w:r>
+      <w:r>
+        <w:rPr>
+          <w:b/>
+          <w:bCs/>
+        </w:rPr>
+        <w:t xml:space="preserve">“tại sao tính peak chứ không avg?”</w:t>
+      </w:r>
+      <w:r>
+        <w:t xml:space="preserve">:</w:t>
+      </w:r>
+      <w:r>
+        <w:t xml:space="preserve"> </w:t>
+      </w:r>
+      <w:r>
+        <w:t xml:space="preserve">&gt; Capacity phải gánh peak. Nếu provision theo avg 1K → flash sale peak 10K sập 9 phút đầu tiên. Production = peak × buffer 50%.</w:t>
+      </w:r>
+    </w:p>
+    <w:p>
+      <w:pPr>
+        <w:pStyle w:val="BodyText"/>
+      </w:pPr>
+      <w:r>
+        <w:rPr>
+          <w:b/>
+          <w:bCs/>
+        </w:rPr>
+        <w:t xml:space="preserve">Defend</w:t>
+      </w:r>
+      <w:r>
+        <w:rPr>
+          <w:b/>
+          <w:bCs/>
+        </w:rPr>
+        <w:t xml:space="preserve"> </w:t>
+      </w:r>
+      <w:r>
+        <w:rPr>
+          <w:b/>
+          <w:bCs/>
+        </w:rPr>
+        <w:t xml:space="preserve">“traffic chỉ Read/Write thôi?”</w:t>
+      </w:r>
+      <w:r>
+        <w:t xml:space="preserve">:</w:t>
+      </w:r>
+      <w:r>
+        <w:t xml:space="preserve"> </w:t>
+      </w:r>
+      <w:r>
+        <w:t xml:space="preserve">&gt; Đây là</w:t>
+      </w:r>
+      <w:r>
+        <w:t xml:space="preserve"> </w:t>
+      </w:r>
+      <w:r>
+        <w:rPr>
+          <w:b/>
+          <w:bCs/>
+        </w:rPr>
+        <w:t xml:space="preserve">traffic layer</w:t>
+      </w:r>
+      <w:r>
+        <w:t xml:space="preserve"> </w:t>
+      </w:r>
+      <w:r>
+        <w:t xml:space="preserve">(HTTP request). Số user (DAU) đếm ở</w:t>
+      </w:r>
+      <w:r>
+        <w:t xml:space="preserve"> </w:t>
+      </w:r>
+      <w:r>
+        <w:rPr>
+          <w:b/>
+          <w:bCs/>
+        </w:rPr>
+        <w:t xml:space="preserve">business layer</w:t>
+      </w:r>
+      <w:r>
+        <w:t xml:space="preserve"> </w:t>
+      </w:r>
+      <w:r>
+        <w:t xml:space="preserve">(DAU/MAU 20-40%, peak concurrent 5-15% DAU, 0.1-0.5 req/s/user). Compute đếm ở</w:t>
+      </w:r>
+      <w:r>
+        <w:t xml:space="preserve"> </w:t>
+      </w:r>
+      <w:r>
+        <w:rPr>
+          <w:b/>
+          <w:bCs/>
+        </w:rPr>
+        <w:t xml:space="preserve">infrastructure layer</w:t>
+      </w:r>
+      <w:r>
+        <w:t xml:space="preserve"> </w:t>
+      </w:r>
+      <w:r>
+        <w:t xml:space="preserve">(pod, node, IOPS).</w:t>
       </w:r>
     </w:p>
     <w:p>
@@ -4771,13 +6446,2302 @@
         </w:pict>
       </w:r>
     </w:p>
-    <w:bookmarkEnd w:id="34"/>
-    <w:bookmarkStart w:id="35" w:name="resume-protocol"/>
+    <w:bookmarkEnd w:id="38"/>
+    <w:bookmarkStart w:id="39" w:name="tính-2-compute"/>
+    <w:p>
+      <w:pPr>
+        <w:pStyle w:val="Heading4"/>
+      </w:pPr>
+      <w:r>
+        <w:t xml:space="preserve">Tính 2 — Compute</w:t>
+      </w:r>
+    </w:p>
+    <w:p>
+      <w:pPr>
+        <w:pStyle w:val="SourceCode"/>
+      </w:pPr>
+      <w:r>
+        <w:rPr>
+          <w:rStyle w:val="VerbatimChar"/>
+        </w:rPr>
+        <w:t xml:space="preserve">1 pod Go/Java tuned ~ 500 rps (P95 &lt; 300ms)</w:t>
+      </w:r>
+      <w:r>
+        <w:br/>
+      </w:r>
+      <w:r>
+        <w:rPr>
+          <w:rStyle w:val="VerbatimChar"/>
+        </w:rPr>
+        <w:t xml:space="preserve">Tổng rps = 10,000</w:t>
+      </w:r>
+      <w:r>
+        <w:br/>
+      </w:r>
+      <w:r>
+        <w:rPr>
+          <w:rStyle w:val="VerbatimChar"/>
+        </w:rPr>
+        <w:t xml:space="preserve">Số pod = 10,000 / 500 = 20 pod</w:t>
+      </w:r>
+      <w:r>
+        <w:br/>
+      </w:r>
+      <w:r>
+        <w:rPr>
+          <w:rStyle w:val="VerbatimChar"/>
+        </w:rPr>
+        <w:t xml:space="preserve">+ Buffer 50% HA + scale headroom = 30 pod</w:t>
+      </w:r>
+    </w:p>
+    <w:p>
+      <w:pPr>
+        <w:pStyle w:val="FirstParagraph"/>
+      </w:pPr>
+      <w:r>
+        <w:rPr>
+          <w:b/>
+          <w:bCs/>
+        </w:rPr>
+        <w:t xml:space="preserve">Vì sao 500 rps/pod?</w:t>
+      </w:r>
+      <w:r>
+        <w:t xml:space="preserve"> </w:t>
+      </w:r>
+      <w:r>
+        <w:t xml:space="preserve">— anchor industry: Go binary native + DB pool tuned + sidecar nhẹ. Java Spring Boot thường ~200-300 rps. Python Flask gunicorn ~100 rps.</w:t>
+      </w:r>
+    </w:p>
+    <w:p>
+      <w:pPr>
+        <w:pStyle w:val="BodyText"/>
+      </w:pPr>
+      <w:r>
+        <w:rPr>
+          <w:b/>
+          <w:bCs/>
+        </w:rPr>
+        <w:t xml:space="preserve">Vì sao +50% buffer?</w:t>
+      </w:r>
+      <w:r>
+        <w:t xml:space="preserve"> </w:t>
+      </w:r>
+      <w:r>
+        <w:t xml:space="preserve">- Multi-AZ: 1 AZ chết, AZ kia phải gánh full</w:t>
+      </w:r>
+      <w:r>
+        <w:t xml:space="preserve"> </w:t>
+      </w:r>
+      <w:r>
+        <w:t xml:space="preserve">- HPA scale-out chậm 30-60s, cần headroom</w:t>
+      </w:r>
+      <w:r>
+        <w:t xml:space="preserve"> </w:t>
+      </w:r>
+      <w:r>
+        <w:t xml:space="preserve">- Pod restart, deploy rolling</w:t>
+      </w:r>
+    </w:p>
+    <w:p>
+      <w:pPr>
+        <w:pStyle w:val="SourceCode"/>
+      </w:pPr>
+      <w:r>
+        <w:rPr>
+          <w:rStyle w:val="VerbatimChar"/>
+        </w:rPr>
+        <w:t xml:space="preserve">1 node c6i.large (2 vCPU, 4GB):</w:t>
+      </w:r>
+      <w:r>
+        <w:br/>
+      </w:r>
+      <w:r>
+        <w:rPr>
+          <w:rStyle w:val="VerbatimChar"/>
+        </w:rPr>
+        <w:t xml:space="preserve">  - Net usable: 1800m CPU + 3.5Gi RAM (sau OS + kubelet + system pod)</w:t>
+      </w:r>
+      <w:r>
+        <w:br/>
+      </w:r>
+      <w:r>
+        <w:rPr>
+          <w:rStyle w:val="VerbatimChar"/>
+        </w:rPr>
+        <w:t xml:space="preserve">  - Chứa ~6 pod tuned (requests 250m + 512Mi)</w:t>
+      </w:r>
+      <w:r>
+        <w:br/>
+      </w:r>
+      <w:r>
+        <w:rPr>
+          <w:rStyle w:val="VerbatimChar"/>
+        </w:rPr>
+        <w:t xml:space="preserve">Số node = 30 / 6 = 5 node</w:t>
+      </w:r>
+      <w:r>
+        <w:br/>
+      </w:r>
+      <w:r>
+        <w:rPr>
+          <w:rStyle w:val="VerbatimChar"/>
+        </w:rPr>
+        <w:t xml:space="preserve">× 2 multi-AZ (mỗi AZ tự đủ tải) = 10 node tổng</w:t>
+      </w:r>
+    </w:p>
+    <w:p>
+      <w:pPr>
+        <w:pStyle w:val="FirstParagraph"/>
+      </w:pPr>
+      <w:r>
+        <w:rPr>
+          <w:b/>
+          <w:bCs/>
+        </w:rPr>
+        <w:t xml:space="preserve">Vì sao 6 pod/node?</w:t>
+      </w:r>
+      <w:r>
+        <w:t xml:space="preserve"> </w:t>
+      </w:r>
+      <w:r>
+        <w:t xml:space="preserve">Phụ thuộc requests:</w:t>
+      </w:r>
+    </w:p>
+    <w:tbl>
+      <w:tblPr>
+        <w:tblStyle w:val="Table"/>
+        <w:tblW w:type="pct" w:w="5000"/>
+        <w:tblLayout w:type="fixed"/>
+        <w:tblLook w:firstRow="1" w:lastRow="0" w:firstColumn="0" w:lastColumn="0" w:noHBand="0" w:noVBand="0" w:val="0020"/>
+      </w:tblPr>
+      <w:tblGrid>
+        <w:gridCol w:w="2640"/>
+        <w:gridCol w:w="2640"/>
+        <w:gridCol w:w="2640"/>
+      </w:tblGrid>
+      <w:tr>
+        <w:trPr>
+          <w:tblHeader w:val="on"/>
+        </w:trPr>
+        <w:tc>
+          <w:tcPr/>
+          <w:p>
+            <w:pPr>
+              <w:pStyle w:val="Compact"/>
+            </w:pPr>
+            <w:r>
+              <w:t xml:space="preserve">Pod size</w:t>
+            </w:r>
+          </w:p>
+        </w:tc>
+        <w:tc>
+          <w:tcPr/>
+          <w:p>
+            <w:pPr>
+              <w:pStyle w:val="Compact"/>
+            </w:pPr>
+            <w:r>
+              <w:t xml:space="preserve">Pod/node</w:t>
+            </w:r>
+          </w:p>
+        </w:tc>
+        <w:tc>
+          <w:tcPr/>
+          <w:p>
+            <w:pPr>
+              <w:pStyle w:val="Compact"/>
+            </w:pPr>
+            <w:r>
+              <w:t xml:space="preserve">Khi nào</w:t>
+            </w:r>
+          </w:p>
+        </w:tc>
+      </w:tr>
+      <w:tr>
+        <w:tc>
+          <w:tcPr/>
+          <w:p>
+            <w:pPr>
+              <w:pStyle w:val="Compact"/>
+            </w:pPr>
+            <w:r>
+              <w:t xml:space="preserve">Nặng (500m + 512Mi)</w:t>
+            </w:r>
+          </w:p>
+        </w:tc>
+        <w:tc>
+          <w:tcPr/>
+          <w:p>
+            <w:pPr>
+              <w:pStyle w:val="Compact"/>
+            </w:pPr>
+            <w:r>
+              <w:t xml:space="preserve">3</w:t>
+            </w:r>
+          </w:p>
+        </w:tc>
+        <w:tc>
+          <w:tcPr/>
+          <w:p>
+            <w:pPr>
+              <w:pStyle w:val="Compact"/>
+            </w:pPr>
+            <w:r>
+              <w:t xml:space="preserve">Java heap 1Gi</w:t>
+            </w:r>
+          </w:p>
+        </w:tc>
+      </w:tr>
+      <w:tr>
+        <w:tc>
+          <w:tcPr/>
+          <w:p>
+            <w:pPr>
+              <w:pStyle w:val="Compact"/>
+            </w:pPr>
+            <w:r>
+              <w:rPr>
+                <w:b/>
+                <w:bCs/>
+              </w:rPr>
+              <w:t xml:space="preserve">Trung bình (250m + 512Mi)</w:t>
+            </w:r>
+          </w:p>
+        </w:tc>
+        <w:tc>
+          <w:tcPr/>
+          <w:p>
+            <w:pPr>
+              <w:pStyle w:val="Compact"/>
+            </w:pPr>
+            <w:r>
+              <w:rPr>
+                <w:b/>
+                <w:bCs/>
+              </w:rPr>
+              <w:t xml:space="preserve">6</w:t>
+            </w:r>
+            <w:r>
+              <w:t xml:space="preserve"> </w:t>
+            </w:r>
+            <w:r>
+              <w:t xml:space="preserve">← em dùng</w:t>
+            </w:r>
+          </w:p>
+        </w:tc>
+        <w:tc>
+          <w:tcPr/>
+          <w:p>
+            <w:pPr>
+              <w:pStyle w:val="Compact"/>
+            </w:pPr>
+            <w:r>
+              <w:t xml:space="preserve">Go tuned</w:t>
+            </w:r>
+          </w:p>
+        </w:tc>
+      </w:tr>
+      <w:tr>
+        <w:tc>
+          <w:tcPr/>
+          <w:p>
+            <w:pPr>
+              <w:pStyle w:val="Compact"/>
+            </w:pPr>
+            <w:r>
+              <w:t xml:space="preserve">Nhẹ (100m + 128Mi)</w:t>
+            </w:r>
+          </w:p>
+        </w:tc>
+        <w:tc>
+          <w:tcPr/>
+          <w:p>
+            <w:pPr>
+              <w:pStyle w:val="Compact"/>
+            </w:pPr>
+            <w:r>
+              <w:t xml:space="preserve">15-20</w:t>
+            </w:r>
+          </w:p>
+        </w:tc>
+        <w:tc>
+          <w:tcPr/>
+          <w:p>
+            <w:pPr>
+              <w:pStyle w:val="Compact"/>
+            </w:pPr>
+            <w:r>
+              <w:t xml:space="preserve">Microservice nhỏ (limit max-pods ENI: 29 default, 110 prefix delegation)</w:t>
+            </w:r>
+          </w:p>
+        </w:tc>
+      </w:tr>
+    </w:tbl>
+    <w:p>
+      <w:pPr>
+        <w:pStyle w:val="BodyText"/>
+      </w:pPr>
+      <w:r>
+        <w:rPr>
+          <w:b/>
+          <w:bCs/>
+        </w:rPr>
+        <w:t xml:space="preserve">Output Compute</w:t>
+      </w:r>
+      <w:r>
+        <w:t xml:space="preserve">:</w:t>
+      </w:r>
+    </w:p>
+    <w:p>
+      <w:pPr>
+        <w:pStyle w:val="SourceCode"/>
+      </w:pPr>
+      <w:r>
+        <w:rPr>
+          <w:rStyle w:val="VerbatimChar"/>
+        </w:rPr>
+        <w:t xml:space="preserve">EKS Managed Nodegroup:</w:t>
+      </w:r>
+      <w:r>
+        <w:br/>
+      </w:r>
+      <w:r>
+        <w:rPr>
+          <w:rStyle w:val="VerbatimChar"/>
+        </w:rPr>
+        <w:t xml:space="preserve">- Instance: c6i.large</w:t>
+      </w:r>
+      <w:r>
+        <w:br/>
+      </w:r>
+      <w:r>
+        <w:rPr>
+          <w:rStyle w:val="VerbatimChar"/>
+        </w:rPr>
+        <w:t xml:space="preserve">- Peak: 10 node (ASG max)</w:t>
+      </w:r>
+      <w:r>
+        <w:br/>
+      </w:r>
+      <w:r>
+        <w:rPr>
+          <w:rStyle w:val="VerbatimChar"/>
+        </w:rPr>
+        <w:t xml:space="preserve">- Baseline: 3-4 node (avg 1K rps)</w:t>
+      </w:r>
+      <w:r>
+        <w:br/>
+      </w:r>
+      <w:r>
+        <w:rPr>
+          <w:rStyle w:val="VerbatimChar"/>
+        </w:rPr>
+        <w:t xml:space="preserve">- HPA pod theo CPU &gt; 60% (KHÔNG 80% — scale delay 30-60s cần headroom)</w:t>
+      </w:r>
+      <w:r>
+        <w:br/>
+      </w:r>
+      <w:r>
+        <w:rPr>
+          <w:rStyle w:val="VerbatimChar"/>
+        </w:rPr>
+        <w:t xml:space="preserve">- Karpenter spawn EC2 60-90s</w:t>
+      </w:r>
+    </w:p>
+    <w:p>
+      <w:pPr>
+        <w:pStyle w:val="FirstParagraph"/>
+      </w:pPr>
+      <w:r>
+        <w:rPr>
+          <w:b/>
+          <w:bCs/>
+        </w:rPr>
+        <w:t xml:space="preserve">HPA tại sao 60% không 80%?</w:t>
+      </w:r>
+      <w:r>
+        <w:t xml:space="preserve"> </w:t>
+      </w:r>
+      <w:r>
+        <w:t xml:space="preserve">&gt; 80% = đã muộn. Khi HPA detect → tạo pod → schedule → image pull → Ready = 30-60s. Trong 60s đó CPU đã lên 100% → request queue đầy → P95 nổ.</w:t>
+      </w:r>
+      <w:r>
+        <w:t xml:space="preserve"> </w:t>
+      </w:r>
+      <w:r>
+        <w:t xml:space="preserve">&gt; 60% = sớm 20% biên độ → khi Ready CPU vừa qua 80%, headroom kịp.</w:t>
+      </w:r>
+    </w:p>
+    <w:p>
+      <w:pPr>
+        <w:pStyle w:val="BodyText"/>
+      </w:pPr>
+      <w:r>
+        <w:rPr>
+          <w:b/>
+          <w:bCs/>
+        </w:rPr>
+        <w:t xml:space="preserve">Karpenter vs Cluster Autoscaler</w:t>
+      </w:r>
+      <w:r>
+        <w:t xml:space="preserve">:</w:t>
+      </w:r>
+      <w:r>
+        <w:t xml:space="preserve"> </w:t>
+      </w:r>
+      <w:r>
+        <w:t xml:space="preserve">- HPA scale</w:t>
+      </w:r>
+      <w:r>
+        <w:t xml:space="preserve"> </w:t>
+      </w:r>
+      <w:r>
+        <w:rPr>
+          <w:b/>
+          <w:bCs/>
+        </w:rPr>
+        <w:t xml:space="preserve">pod</w:t>
+      </w:r>
+      <w:r>
+        <w:t xml:space="preserve"> </w:t>
+      </w:r>
+      <w:r>
+        <w:t xml:space="preserve">trước (sec)</w:t>
+      </w:r>
+      <w:r>
+        <w:t xml:space="preserve"> </w:t>
+      </w:r>
+      <w:r>
+        <w:t xml:space="preserve">- Pod pending vì hết node → Karpenter spawn</w:t>
+      </w:r>
+      <w:r>
+        <w:t xml:space="preserve"> </w:t>
+      </w:r>
+      <w:r>
+        <w:rPr>
+          <w:b/>
+          <w:bCs/>
+        </w:rPr>
+        <w:t xml:space="preserve">EC2 mới</w:t>
+      </w:r>
+      <w:r>
+        <w:t xml:space="preserve"> </w:t>
+      </w:r>
+      <w:r>
+        <w:t xml:space="preserve">(60-90s) — chọn instance type tối ưu theo workload</w:t>
+      </w:r>
+      <w:r>
+        <w:t xml:space="preserve"> </w:t>
+      </w:r>
+      <w:r>
+        <w:t xml:space="preserve">- CA cũ scale theo ASG fix instance type → đắt hơn 20-30% và chậm hơn</w:t>
+      </w:r>
+    </w:p>
+    <w:p>
+      <w:pPr>
+        <w:pStyle w:val="BodyText"/>
+      </w:pPr>
+      <w:r>
+        <w:rPr>
+          <w:b/>
+          <w:bCs/>
+        </w:rPr>
+        <w:t xml:space="preserve">Defend</w:t>
+      </w:r>
+      <w:r>
+        <w:rPr>
+          <w:b/>
+          <w:bCs/>
+        </w:rPr>
+        <w:t xml:space="preserve"> </w:t>
+      </w:r>
+      <w:r>
+        <w:rPr>
+          <w:b/>
+          <w:bCs/>
+        </w:rPr>
+        <w:t xml:space="preserve">“tại sao 10 node mà không 5?”</w:t>
+      </w:r>
+      <w:r>
+        <w:t xml:space="preserve">:</w:t>
+      </w:r>
+      <w:r>
+        <w:t xml:space="preserve"> </w:t>
+      </w:r>
+      <w:r>
+        <w:t xml:space="preserve">&gt; 5 node là math thuần. Production em ×2 multi-AZ — 1 AZ chết phải còn AZ kia tự gánh full peak. ×2 là chi phí HA bắt buộc, không phải over-provision.</w:t>
+      </w:r>
+    </w:p>
+    <w:p>
+      <w:r>
+        <w:pict>
+          <v:rect style="width:0;height:1.5pt" o:hralign="center" o:hrstd="t" o:hr="t"/>
+        </w:pict>
+      </w:r>
+    </w:p>
+    <w:bookmarkEnd w:id="39"/>
+    <w:bookmarkStart w:id="40" w:name="tính-3-db-iops"/>
+    <w:p>
+      <w:pPr>
+        <w:pStyle w:val="Heading4"/>
+      </w:pPr>
+      <w:r>
+        <w:t xml:space="preserve">Tính 3 — DB IOPS</w:t>
+      </w:r>
+    </w:p>
+    <w:p>
+      <w:pPr>
+        <w:pStyle w:val="FirstParagraph"/>
+      </w:pPr>
+      <w:r>
+        <w:rPr>
+          <w:b/>
+          <w:bCs/>
+        </w:rPr>
+        <w:t xml:space="preserve">Confuse thường gặp</w:t>
+      </w:r>
+      <w:r>
+        <w:t xml:space="preserve">: Read:Write 95:5 ở traffic layer ≠ DB query.</w:t>
+      </w:r>
+    </w:p>
+    <w:tbl>
+      <w:tblPr>
+        <w:tblStyle w:val="Table"/>
+        <w:tblW w:type="auto" w:w="0"/>
+        <w:tblLook w:firstRow="1" w:lastRow="0" w:firstColumn="0" w:lastColumn="0" w:noHBand="0" w:noVBand="0" w:val="0020"/>
+      </w:tblPr>
+      <w:tblGrid>
+        <w:gridCol w:w="2640"/>
+        <w:gridCol w:w="2640"/>
+        <w:gridCol w:w="2640"/>
+      </w:tblGrid>
+      <w:tr>
+        <w:trPr>
+          <w:tblHeader w:val="on"/>
+        </w:trPr>
+        <w:tc>
+          <w:tcPr/>
+          <w:p>
+            <w:pPr>
+              <w:pStyle w:val="Compact"/>
+            </w:pPr>
+            <w:r>
+              <w:t xml:space="preserve">Lớp</w:t>
+            </w:r>
+          </w:p>
+        </w:tc>
+        <w:tc>
+          <w:tcPr/>
+          <w:p>
+            <w:pPr>
+              <w:pStyle w:val="Compact"/>
+            </w:pPr>
+            <w:r>
+              <w:t xml:space="preserve">Đơn vị</w:t>
+            </w:r>
+          </w:p>
+        </w:tc>
+        <w:tc>
+          <w:tcPr/>
+          <w:p>
+            <w:pPr>
+              <w:pStyle w:val="Compact"/>
+            </w:pPr>
+            <w:r>
+              <w:t xml:space="preserve">Ai gánh</w:t>
+            </w:r>
+          </w:p>
+        </w:tc>
+      </w:tr>
+      <w:tr>
+        <w:tc>
+          <w:tcPr/>
+          <w:p>
+            <w:pPr>
+              <w:pStyle w:val="Compact"/>
+            </w:pPr>
+            <w:r>
+              <w:t xml:space="preserve">Traffic 10K rps</w:t>
+            </w:r>
+          </w:p>
+        </w:tc>
+        <w:tc>
+          <w:tcPr/>
+          <w:p>
+            <w:pPr>
+              <w:pStyle w:val="Compact"/>
+            </w:pPr>
+            <w:r>
+              <w:t xml:space="preserve">HTTP request</w:t>
+            </w:r>
+          </w:p>
+        </w:tc>
+        <w:tc>
+          <w:tcPr/>
+          <w:p>
+            <w:pPr>
+              <w:pStyle w:val="Compact"/>
+            </w:pPr>
+            <w:r>
+              <w:t xml:space="preserve">Pod app</w:t>
+            </w:r>
+          </w:p>
+        </w:tc>
+      </w:tr>
+      <w:tr>
+        <w:tc>
+          <w:tcPr/>
+          <w:p>
+            <w:pPr>
+              <w:pStyle w:val="Compact"/>
+            </w:pPr>
+            <w:r>
+              <w:t xml:space="preserve">DB IOPS</w:t>
+            </w:r>
+          </w:p>
+        </w:tc>
+        <w:tc>
+          <w:tcPr/>
+          <w:p>
+            <w:pPr>
+              <w:pStyle w:val="Compact"/>
+            </w:pPr>
+            <w:r>
+              <w:t xml:space="preserve">Query SQL</w:t>
+            </w:r>
+          </w:p>
+        </w:tc>
+        <w:tc>
+          <w:tcPr/>
+          <w:p>
+            <w:pPr>
+              <w:pStyle w:val="Compact"/>
+            </w:pPr>
+            <w:r>
+              <w:t xml:space="preserve">RDS/Aurora</w:t>
+            </w:r>
+          </w:p>
+        </w:tc>
+      </w:tr>
+    </w:tbl>
+    <w:p>
+      <w:pPr>
+        <w:pStyle w:val="BodyText"/>
+      </w:pPr>
+      <w:r>
+        <w:t xml:space="preserve">Trên đường đi có</w:t>
+      </w:r>
+      <w:r>
+        <w:t xml:space="preserve"> </w:t>
+      </w:r>
+      <w:r>
+        <w:rPr>
+          <w:b/>
+          <w:bCs/>
+        </w:rPr>
+        <w:t xml:space="preserve">cache</w:t>
+      </w:r>
+      <w:r>
+        <w:t xml:space="preserve"> </w:t>
+      </w:r>
+      <w:r>
+        <w:t xml:space="preserve">(CDN, Redis) chặn lại → cache hit không đụng DB.</w:t>
+      </w:r>
+    </w:p>
+    <w:p>
+      <w:pPr>
+        <w:pStyle w:val="BodyText"/>
+      </w:pPr>
+      <w:r>
+        <w:rPr>
+          <w:b/>
+          <w:bCs/>
+        </w:rPr>
+        <w:t xml:space="preserve">Bước 1 — Cache hit ratio</w:t>
+      </w:r>
+      <w:r>
+        <w:t xml:space="preserve">:</w:t>
+      </w:r>
+    </w:p>
+    <w:p>
+      <w:pPr>
+        <w:pStyle w:val="SourceCode"/>
+      </w:pPr>
+      <w:r>
+        <w:rPr>
+          <w:rStyle w:val="VerbatimChar"/>
+        </w:rPr>
+        <w:t xml:space="preserve">Cache hit giả định 80% (Pareto e-commerce, Pareto 80/20 SKU)</w:t>
+      </w:r>
+      <w:r>
+        <w:br/>
+      </w:r>
+      <w:r>
+        <w:rPr>
+          <w:rStyle w:val="VerbatimChar"/>
+        </w:rPr>
+        <w:t xml:space="preserve">  → 9,500 × 0.80 = 7,600 rps cache trả về (KHÔNG đụng DB)</w:t>
+      </w:r>
+      <w:r>
+        <w:br/>
+      </w:r>
+      <w:r>
+        <w:rPr>
+          <w:rStyle w:val="VerbatimChar"/>
+        </w:rPr>
+        <w:t xml:space="preserve">  → 9,500 × 0.20 = 1,900 rps cache MISS → đụng DB</w:t>
+      </w:r>
+    </w:p>
+    <w:p>
+      <w:pPr>
+        <w:pStyle w:val="FirstParagraph"/>
+      </w:pPr>
+      <w:r>
+        <w:rPr>
+          <w:b/>
+          <w:bCs/>
+        </w:rPr>
+        <w:t xml:space="preserve">80/20 lấy ở đâu?</w:t>
+      </w:r>
+      <w:r>
+        <w:t xml:space="preserve"> </w:t>
+      </w:r>
+      <w:r>
+        <w:t xml:space="preserve">— 3 nguồn:</w:t>
+      </w:r>
+      <w:r>
+        <w:t xml:space="preserve"> </w:t>
+      </w:r>
+      <w:r>
+        <w:t xml:space="preserve">1.</w:t>
+      </w:r>
+      <w:r>
+        <w:t xml:space="preserve"> </w:t>
+      </w:r>
+      <w:r>
+        <w:rPr>
+          <w:b/>
+          <w:bCs/>
+        </w:rPr>
+        <w:t xml:space="preserve">Pareto 80/20</w:t>
+      </w:r>
+      <w:r>
+        <w:t xml:space="preserve">: 20% SKU hot (best-seller, flash sale) sinh 80% read traffic</w:t>
+      </w:r>
+      <w:r>
+        <w:t xml:space="preserve"> </w:t>
+      </w:r>
+      <w:r>
+        <w:t xml:space="preserve">2.</w:t>
+      </w:r>
+      <w:r>
+        <w:t xml:space="preserve"> </w:t>
+      </w:r>
+      <w:r>
+        <w:rPr>
+          <w:b/>
+          <w:bCs/>
+        </w:rPr>
+        <w:t xml:space="preserve">Industry benchmark</w:t>
+      </w:r>
+      <w:r>
+        <w:t xml:space="preserve">: Shopify/Amazon/Lazada report cache hit browse page 75-90%</w:t>
+      </w:r>
+      <w:r>
+        <w:t xml:space="preserve"> </w:t>
+      </w:r>
+      <w:r>
+        <w:t xml:space="preserve">3.</w:t>
+      </w:r>
+      <w:r>
+        <w:t xml:space="preserve"> </w:t>
+      </w:r>
+      <w:r>
+        <w:rPr>
+          <w:b/>
+          <w:bCs/>
+        </w:rPr>
+        <w:t xml:space="preserve">Anchor numbers</w:t>
+      </w:r>
+      <w:r>
+        <w:t xml:space="preserve">: e-commerce</w:t>
+      </w:r>
+      <w:r>
+        <w:t xml:space="preserve"> </w:t>
+      </w:r>
+      <w:r>
+        <w:rPr>
+          <w:b/>
+          <w:bCs/>
+        </w:rPr>
+        <w:t xml:space="preserve">80%</w:t>
+      </w:r>
+      <w:r>
+        <w:t xml:space="preserve">, social feed</w:t>
+      </w:r>
+      <w:r>
+        <w:t xml:space="preserve"> </w:t>
+      </w:r>
+      <w:r>
+        <w:rPr>
+          <w:b/>
+          <w:bCs/>
+        </w:rPr>
+        <w:t xml:space="preserve">95%</w:t>
+      </w:r>
+      <w:r>
+        <w:t xml:space="preserve">, search</w:t>
+      </w:r>
+      <w:r>
+        <w:t xml:space="preserve"> </w:t>
+      </w:r>
+      <w:r>
+        <w:rPr>
+          <w:b/>
+          <w:bCs/>
+        </w:rPr>
+        <w:t xml:space="preserve">30-40%</w:t>
+      </w:r>
+    </w:p>
+    <w:p>
+      <w:pPr>
+        <w:pStyle w:val="BodyText"/>
+      </w:pPr>
+      <w:r>
+        <w:rPr>
+          <w:b/>
+          <w:bCs/>
+        </w:rPr>
+        <w:t xml:space="preserve">Defend khi interviewer probe</w:t>
+      </w:r>
+      <w:r>
+        <w:rPr>
+          <w:b/>
+          <w:bCs/>
+        </w:rPr>
+        <w:t xml:space="preserve"> </w:t>
+      </w:r>
+      <w:r>
+        <w:rPr>
+          <w:b/>
+          <w:bCs/>
+        </w:rPr>
+        <w:t xml:space="preserve">“sao 80% không 50%?”</w:t>
+      </w:r>
+      <w:r>
+        <w:t xml:space="preserve">:</w:t>
+      </w:r>
+      <w:r>
+        <w:t xml:space="preserve"> </w:t>
+      </w:r>
+      <w:r>
+        <w:t xml:space="preserve">&gt;</w:t>
+      </w:r>
+      <w:r>
+        <w:t xml:space="preserve"> </w:t>
+      </w:r>
+      <w:r>
+        <w:t xml:space="preserve">“Em assume read-heavy e-commerce với catalog stable, hot SKU sit trong Redis TTL 5-10 phút. Em verify bằng</w:t>
+      </w:r>
+      <w:r>
+        <w:t xml:space="preserve"> </w:t>
+      </w:r>
+      <w:r>
+        <w:rPr>
+          <w:rStyle w:val="VerbatimChar"/>
+        </w:rPr>
+        <w:t xml:space="preserve">redis-cli info stats</w:t>
+      </w:r>
+      <w:r>
+        <w:t xml:space="preserve"> </w:t>
+      </w:r>
+      <w:r>
+        <w:t xml:space="preserve">→</w:t>
+      </w:r>
+      <w:r>
+        <w:t xml:space="preserve"> </w:t>
+      </w:r>
+      <w:r>
+        <w:rPr>
+          <w:rStyle w:val="VerbatimChar"/>
+        </w:rPr>
+        <w:t xml:space="preserve">keyspace_hits/(hits+misses)</w:t>
+      </w:r>
+      <w:r>
+        <w:t xml:space="preserve"> </w:t>
+      </w:r>
+      <w:r>
+        <w:t xml:space="preserve">sau go-live tuần đầu. Nếu chỉ 50% → cache không đủ hot key (tăng RAM) / TTL ngắn (kéo lên) / thundering herd.”</w:t>
+      </w:r>
+    </w:p>
+    <w:p>
+      <w:pPr>
+        <w:pStyle w:val="BodyText"/>
+      </w:pPr>
+      <w:r>
+        <w:rPr>
+          <w:b/>
+          <w:bCs/>
+        </w:rPr>
+        <w:t xml:space="preserve">Bước 2 — Query DB thực</w:t>
+      </w:r>
+      <w:r>
+        <w:t xml:space="preserve">:</w:t>
+      </w:r>
+    </w:p>
+    <w:p>
+      <w:pPr>
+        <w:pStyle w:val="SourceCode"/>
+      </w:pPr>
+      <w:r>
+        <w:rPr>
+          <w:rStyle w:val="VerbatimChar"/>
+        </w:rPr>
+        <w:t xml:space="preserve">Read miss   = 1,900 query/s</w:t>
+      </w:r>
+      <w:r>
+        <w:br/>
+      </w:r>
+      <w:r>
+        <w:rPr>
+          <w:rStyle w:val="VerbatimChar"/>
+        </w:rPr>
+        <w:t xml:space="preserve">Write       =   500 query/s  (write KHÔNG cache, replicate luôn DB)</w:t>
+      </w:r>
+      <w:r>
+        <w:br/>
+      </w:r>
+      <w:r>
+        <w:rPr>
+          <w:rStyle w:val="VerbatimChar"/>
+        </w:rPr>
+        <w:t xml:space="preserve">─────────────────────────────</w:t>
+      </w:r>
+      <w:r>
+        <w:br/>
+      </w:r>
+      <w:r>
+        <w:rPr>
+          <w:rStyle w:val="VerbatimChar"/>
+        </w:rPr>
+        <w:t xml:space="preserve">Tổng        = 2,400 query/s</w:t>
+      </w:r>
+    </w:p>
+    <w:p>
+      <w:pPr>
+        <w:pStyle w:val="FirstParagraph"/>
+      </w:pPr>
+      <w:r>
+        <w:rPr>
+          <w:b/>
+          <w:bCs/>
+        </w:rPr>
+        <w:t xml:space="preserve">Bước 3 — IOPS</w:t>
+      </w:r>
+      <w:r>
+        <w:t xml:space="preserve">:</w:t>
+      </w:r>
+    </w:p>
+    <w:p>
+      <w:pPr>
+        <w:pStyle w:val="SourceCode"/>
+      </w:pPr>
+      <w:r>
+        <w:rPr>
+          <w:rStyle w:val="VerbatimChar"/>
+        </w:rPr>
+        <w:t xml:space="preserve">1 query OLTP ~ 2 IOPS (avg: index lookup + row read + WAL)</w:t>
+      </w:r>
+      <w:r>
+        <w:br/>
+      </w:r>
+      <w:r>
+        <w:rPr>
+          <w:rStyle w:val="VerbatimChar"/>
+        </w:rPr>
+        <w:t xml:space="preserve">Peak IOPS = 2,400 × 2 = 4,800</w:t>
+      </w:r>
+      <w:r>
+        <w:br/>
+      </w:r>
+      <w:r>
+        <w:rPr>
+          <w:rStyle w:val="VerbatimChar"/>
+        </w:rPr>
+        <w:t xml:space="preserve">+ 50% buffer (replication lag, vacuum) = ~7,200 IOPS</w:t>
+      </w:r>
+    </w:p>
+    <w:p>
+      <w:pPr>
+        <w:pStyle w:val="FirstParagraph"/>
+      </w:pPr>
+      <w:r>
+        <w:rPr>
+          <w:b/>
+          <w:bCs/>
+        </w:rPr>
+        <w:t xml:space="preserve">Bước 4 — Chọn DB</w:t>
+      </w:r>
+      <w:r>
+        <w:t xml:space="preserve">:</w:t>
+      </w:r>
+    </w:p>
+    <w:p>
+      <w:pPr>
+        <w:pStyle w:val="SourceCode"/>
+      </w:pPr>
+      <w:r>
+        <w:rPr>
+          <w:rStyle w:val="VerbatimChar"/>
+        </w:rPr>
+        <w:t xml:space="preserve">Aurora MySQL db.r6g.large:</w:t>
+      </w:r>
+      <w:r>
+        <w:br/>
+      </w:r>
+      <w:r>
+        <w:rPr>
+          <w:rStyle w:val="VerbatimChar"/>
+        </w:rPr>
+        <w:t xml:space="preserve">- 2 vCPU, 16GB RAM</w:t>
+      </w:r>
+      <w:r>
+        <w:br/>
+      </w:r>
+      <w:r>
+        <w:rPr>
+          <w:rStyle w:val="VerbatimChar"/>
+        </w:rPr>
+        <w:t xml:space="preserve">- Connection pool: 1,000</w:t>
+      </w:r>
+      <w:r>
+        <w:br/>
+      </w:r>
+      <w:r>
+        <w:rPr>
+          <w:rStyle w:val="VerbatimChar"/>
+        </w:rPr>
+        <w:t xml:space="preserve">- IOPS auto-scale theo storage, baseline 3K burst 12K</w:t>
+      </w:r>
+      <w:r>
+        <w:br/>
+      </w:r>
+      <w:r>
+        <w:rPr>
+          <w:rStyle w:val="VerbatimChar"/>
+        </w:rPr>
+        <w:t xml:space="preserve">- Storage Aurora separate compute (auto-extend 128TB)</w:t>
+      </w:r>
+      <w:r>
+        <w:br/>
+      </w:r>
+      <w:r>
+        <w:rPr>
+          <w:rStyle w:val="VerbatimChar"/>
+        </w:rPr>
+        <w:t xml:space="preserve">→ Peak 7,200 IOPS nằm trong burst ✅</w:t>
+      </w:r>
+      <w:r>
+        <w:br/>
+      </w:r>
+      <w:r>
+        <w:br/>
+      </w:r>
+      <w:r>
+        <w:rPr>
+          <w:rStyle w:val="VerbatimChar"/>
+        </w:rPr>
+        <w:t xml:space="preserve">Topology:</w:t>
+      </w:r>
+      <w:r>
+        <w:br/>
+      </w:r>
+      <w:r>
+        <w:rPr>
+          <w:rStyle w:val="VerbatimChar"/>
+        </w:rPr>
+        <w:t xml:space="preserve">- 1 writer + 2 read replica (multi-AZ)</w:t>
+      </w:r>
+      <w:r>
+        <w:br/>
+      </w:r>
+      <w:r>
+        <w:rPr>
+          <w:rStyle w:val="VerbatimChar"/>
+        </w:rPr>
+        <w:t xml:space="preserve">- 2 replica chia 1,900 read miss = 950 query/s mỗi replica</w:t>
+      </w:r>
+      <w:r>
+        <w:br/>
+      </w:r>
+      <w:r>
+        <w:rPr>
+          <w:rStyle w:val="VerbatimChar"/>
+        </w:rPr>
+        <w:t xml:space="preserve">- Failover tự động &lt;30s</w:t>
+      </w:r>
+      <w:r>
+        <w:br/>
+      </w:r>
+      <w:r>
+        <w:rPr>
+          <w:rStyle w:val="VerbatimChar"/>
+        </w:rPr>
+        <w:t xml:space="preserve">- Checkout PHẢI đọc writer (read-after-write consistency)</w:t>
+      </w:r>
+    </w:p>
+    <w:p>
+      <w:pPr>
+        <w:pStyle w:val="FirstParagraph"/>
+      </w:pPr>
+      <w:r>
+        <w:rPr>
+          <w:b/>
+          <w:bCs/>
+        </w:rPr>
+        <w:t xml:space="preserve">Defend</w:t>
+      </w:r>
+      <w:r>
+        <w:rPr>
+          <w:b/>
+          <w:bCs/>
+        </w:rPr>
+        <w:t xml:space="preserve"> </w:t>
+      </w:r>
+      <w:r>
+        <w:rPr>
+          <w:b/>
+          <w:bCs/>
+        </w:rPr>
+        <w:t xml:space="preserve">“tại sao r6g chứ không r5/r6i?”</w:t>
+      </w:r>
+      <w:r>
+        <w:t xml:space="preserve">:</w:t>
+      </w:r>
+      <w:r>
+        <w:t xml:space="preserve"> </w:t>
+      </w:r>
+      <w:r>
+        <w:t xml:space="preserve">&gt; r6g = Graviton ARM, rẻ hơn x86 ~20%, perf tương đương cho OLTP MySQL. Non-Windows DB em default r6g. Oracle/MSSQL license bắt x86 mới r6i.</w:t>
+      </w:r>
+    </w:p>
+    <w:p>
+      <w:pPr>
+        <w:pStyle w:val="BodyText"/>
+      </w:pPr>
+      <w:r>
+        <w:rPr>
+          <w:b/>
+          <w:bCs/>
+        </w:rPr>
+        <w:t xml:space="preserve">Defend</w:t>
+      </w:r>
+      <w:r>
+        <w:rPr>
+          <w:b/>
+          <w:bCs/>
+        </w:rPr>
+        <w:t xml:space="preserve"> </w:t>
+      </w:r>
+      <w:r>
+        <w:rPr>
+          <w:b/>
+          <w:bCs/>
+        </w:rPr>
+        <w:t xml:space="preserve">“tại sao 2 read replica?”</w:t>
+      </w:r>
+      <w:r>
+        <w:t xml:space="preserve">:</w:t>
+      </w:r>
+      <w:r>
+        <w:t xml:space="preserve"> </w:t>
+      </w:r>
+      <w:r>
+        <w:t xml:space="preserve">&gt; 1 replica fail thì replica còn lại gánh đủ 1,900 read. Nếu chỉ 1 → mất là sập tải read.</w:t>
+      </w:r>
+    </w:p>
+    <w:p>
+      <w:pPr>
+        <w:pStyle w:val="BodyText"/>
+      </w:pPr>
+      <w:r>
+        <w:rPr>
+          <w:b/>
+          <w:bCs/>
+        </w:rPr>
+        <w:t xml:space="preserve">Cảnh báo trade-off (Senior khoe)</w:t>
+      </w:r>
+      <w:r>
+        <w:t xml:space="preserve">:</w:t>
+      </w:r>
+      <w:r>
+        <w:t xml:space="preserve"> </w:t>
+      </w:r>
+      <w:r>
+        <w:t xml:space="preserve">&gt; Cache hit 80% là</w:t>
+      </w:r>
+      <w:r>
+        <w:t xml:space="preserve"> </w:t>
+      </w:r>
+      <w:r>
+        <w:rPr>
+          <w:b/>
+          <w:bCs/>
+        </w:rPr>
+        <w:t xml:space="preserve">giả định</w:t>
+      </w:r>
+      <w:r>
+        <w:t xml:space="preserve">. Nếu thực tế chỉ 50% → DB ăn 5,250 query/s × 2 = 10,500 IOPS → phải lên r6g.xlarge hoặc shard.</w:t>
+      </w:r>
+      <w:r>
+        <w:t xml:space="preserve"> </w:t>
+      </w:r>
+      <w:r>
+        <w:t xml:space="preserve">“Rút dây động rừng”</w:t>
+      </w:r>
+      <w:r>
+        <w:t xml:space="preserve">: cache hit % → DB instance → cost → SLA.</w:t>
+      </w:r>
+    </w:p>
+    <w:p>
+      <w:r>
+        <w:pict>
+          <v:rect style="width:0;height:1.5pt" o:hralign="center" o:hrstd="t" o:hr="t"/>
+        </w:pict>
+      </w:r>
+    </w:p>
+    <w:bookmarkEnd w:id="40"/>
+    <w:bookmarkStart w:id="41" w:name="insight-cache-hitmiss-vàng-nhất-step-2"/>
+    <w:p>
+      <w:pPr>
+        <w:pStyle w:val="Heading4"/>
+      </w:pPr>
+      <w:r>
+        <w:t xml:space="preserve">Insight Cache hit/miss (vàng nhất Step 2)</w:t>
+      </w:r>
+    </w:p>
+    <w:p>
+      <w:pPr>
+        <w:pStyle w:val="FirstParagraph"/>
+      </w:pPr>
+      <w:r>
+        <w:rPr>
+          <w:b/>
+          <w:bCs/>
+        </w:rPr>
+        <w:t xml:space="preserve">7,600 rps cache hit — insight</w:t>
+      </w:r>
+      <w:r>
+        <w:t xml:space="preserve">:</w:t>
+      </w:r>
+    </w:p>
+    <w:p>
+      <w:pPr>
+        <w:pStyle w:val="Compact"/>
+        <w:numPr>
+          <w:ilvl w:val="0"/>
+          <w:numId w:val="1005"/>
+        </w:numPr>
+      </w:pPr>
+      <w:r>
+        <w:t xml:space="preserve">Redis trả lời</w:t>
+      </w:r>
+      <w:r>
+        <w:t xml:space="preserve"> </w:t>
+      </w:r>
+      <w:r>
+        <w:rPr>
+          <w:b/>
+          <w:bCs/>
+        </w:rPr>
+        <w:t xml:space="preserve">1-5ms</w:t>
+      </w:r>
+      <w:r>
+        <w:t xml:space="preserve"> </w:t>
+      </w:r>
+      <w:r>
+        <w:t xml:space="preserve">(RAM lookup). DB</w:t>
+      </w:r>
+      <w:r>
+        <w:t xml:space="preserve"> </w:t>
+      </w:r>
+      <w:r>
+        <w:rPr>
+          <w:b/>
+          <w:bCs/>
+        </w:rPr>
+        <w:t xml:space="preserve">KHÔNG biết</w:t>
+      </w:r>
+      <w:r>
+        <w:t xml:space="preserve"> </w:t>
+      </w:r>
+      <w:r>
+        <w:t xml:space="preserve">những request này tồn tại.</w:t>
+      </w:r>
+    </w:p>
+    <w:p>
+      <w:pPr>
+        <w:pStyle w:val="Compact"/>
+        <w:numPr>
+          <w:ilvl w:val="0"/>
+          <w:numId w:val="1005"/>
+        </w:numPr>
+      </w:pPr>
+      <w:r>
+        <w:t xml:space="preserve">Cache là</w:t>
+      </w:r>
+      <w:r>
+        <w:t xml:space="preserve"> </w:t>
+      </w:r>
+      <w:r>
+        <w:rPr>
+          <w:b/>
+          <w:bCs/>
+        </w:rPr>
+        <w:t xml:space="preserve">shock absorber</w:t>
+      </w:r>
+      <w:r>
+        <w:t xml:space="preserve">: Aurora db.r6g.large OLTP chịu</w:t>
+      </w:r>
+      <w:r>
+        <w:t xml:space="preserve"> </w:t>
+      </w:r>
+      <w:r>
+        <w:rPr>
+          <w:b/>
+          <w:bCs/>
+        </w:rPr>
+        <w:t xml:space="preserve">~3K query/s</w:t>
+      </w:r>
+      <w:r>
+        <w:t xml:space="preserve"> </w:t>
+      </w:r>
+      <w:r>
+        <w:t xml:space="preserve">tối đa. KHÔNG cache → 9,500 query/s đập DB → CPU 100% → timeout → sập site.</w:t>
+      </w:r>
+    </w:p>
+    <w:p>
+      <w:pPr>
+        <w:pStyle w:val="Compact"/>
+        <w:numPr>
+          <w:ilvl w:val="0"/>
+          <w:numId w:val="1005"/>
+        </w:numPr>
+      </w:pPr>
+      <w:r>
+        <w:rPr>
+          <w:b/>
+          <w:bCs/>
+        </w:rPr>
+        <w:t xml:space="preserve">Money math</w:t>
+      </w:r>
+      <w:r>
+        <w:t xml:space="preserve">: cache đỡ 80% → tiết kiệm</w:t>
+      </w:r>
+      <w:r>
+        <w:t xml:space="preserve"> </w:t>
+      </w:r>
+      <w:r>
+        <w:rPr>
+          <w:b/>
+          <w:bCs/>
+        </w:rPr>
+        <w:t xml:space="preserve">~$4,000-5,000/tháng</w:t>
+      </w:r>
+      <w:r>
+        <w:t xml:space="preserve"> </w:t>
+      </w:r>
+      <w:r>
+        <w:t xml:space="preserve">(so với scale DB lên 5x).</w:t>
+      </w:r>
+    </w:p>
+    <w:p>
+      <w:pPr>
+        <w:pStyle w:val="Compact"/>
+        <w:numPr>
+          <w:ilvl w:val="0"/>
+          <w:numId w:val="1005"/>
+        </w:numPr>
+      </w:pPr>
+      <w:r>
+        <w:t xml:space="preserve">80% user thấy site</w:t>
+      </w:r>
+      <w:r>
+        <w:t xml:space="preserve"> </w:t>
+      </w:r>
+      <w:r>
+        <w:t xml:space="preserve">“nhanh”</w:t>
+      </w:r>
+      <w:r>
+        <w:t xml:space="preserve"> </w:t>
+      </w:r>
+      <w:r>
+        <w:t xml:space="preserve">(2ms), chỉ 20% chịu chậm (30ms DB query).</w:t>
+      </w:r>
+    </w:p>
+    <w:p>
+      <w:pPr>
+        <w:pStyle w:val="FirstParagraph"/>
+      </w:pPr>
+      <w:r>
+        <w:rPr>
+          <w:b/>
+          <w:bCs/>
+        </w:rPr>
+        <w:t xml:space="preserve">1,900 rps cache miss — health metric</w:t>
+      </w:r>
+      <w:r>
+        <w:t xml:space="preserve">:</w:t>
+      </w:r>
+    </w:p>
+    <w:p>
+      <w:pPr>
+        <w:pStyle w:val="BodyText"/>
+      </w:pPr>
+      <w:r>
+        <w:t xml:space="preserve">3 lý do gây miss:</w:t>
+      </w:r>
+      <w:r>
+        <w:t xml:space="preserve"> </w:t>
+      </w:r>
+      <w:r>
+        <w:t xml:space="preserve">1.</w:t>
+      </w:r>
+      <w:r>
+        <w:t xml:space="preserve"> </w:t>
+      </w:r>
+      <w:r>
+        <w:rPr>
+          <w:b/>
+          <w:bCs/>
+        </w:rPr>
+        <w:t xml:space="preserve">TTL hết hạn</w:t>
+      </w:r>
+      <w:r>
+        <w:t xml:space="preserve"> </w:t>
+      </w:r>
+      <w:r>
+        <w:t xml:space="preserve">— sản phẩm cache 5 phút (bình thường)</w:t>
+      </w:r>
+      <w:r>
+        <w:t xml:space="preserve"> </w:t>
+      </w:r>
+      <w:r>
+        <w:t xml:space="preserve">2.</w:t>
+      </w:r>
+      <w:r>
+        <w:t xml:space="preserve"> </w:t>
+      </w:r>
+      <w:r>
+        <w:rPr>
+          <w:b/>
+          <w:bCs/>
+        </w:rPr>
+        <w:t xml:space="preserve">Key chưa từng cache</w:t>
+      </w:r>
+      <w:r>
+        <w:t xml:space="preserve"> </w:t>
+      </w:r>
+      <w:r>
+        <w:t xml:space="preserve">— long-tail SKU (80% SKU ít người xem)</w:t>
+      </w:r>
+      <w:r>
+        <w:t xml:space="preserve"> </w:t>
+      </w:r>
+      <w:r>
+        <w:t xml:space="preserve">3.</w:t>
+      </w:r>
+      <w:r>
+        <w:t xml:space="preserve"> </w:t>
+      </w:r>
+      <w:r>
+        <w:rPr>
+          <w:b/>
+          <w:bCs/>
+        </w:rPr>
+        <w:t xml:space="preserve">Cache evict</w:t>
+      </w:r>
+      <w:r>
+        <w:t xml:space="preserve"> </w:t>
+      </w:r>
+      <w:r>
+        <w:t xml:space="preserve">— Redis hết RAM, đẩy key cũ ra (cảnh báo)</w:t>
+      </w:r>
+    </w:p>
+    <w:p>
+      <w:pPr>
+        <w:pStyle w:val="BodyText"/>
+      </w:pPr>
+      <w:r>
+        <w:rPr>
+          <w:b/>
+          <w:bCs/>
+        </w:rPr>
+        <w:t xml:space="preserve">Health check</w:t>
+      </w:r>
+      <w:r>
+        <w:t xml:space="preserve">:</w:t>
+      </w:r>
+      <w:r>
+        <w:t xml:space="preserve"> </w:t>
+      </w:r>
+      <w:r>
+        <w:t xml:space="preserve">- Miss rate</w:t>
+      </w:r>
+      <w:r>
+        <w:t xml:space="preserve"> </w:t>
+      </w:r>
+      <w:r>
+        <w:rPr>
+          <w:b/>
+          <w:bCs/>
+        </w:rPr>
+        <w:t xml:space="preserve">15-25%</w:t>
+      </w:r>
+      <w:r>
+        <w:t xml:space="preserve"> </w:t>
+      </w:r>
+      <w:r>
+        <w:t xml:space="preserve">= healthy</w:t>
+      </w:r>
+      <w:r>
+        <w:t xml:space="preserve"> </w:t>
+      </w:r>
+      <w:r>
+        <w:t xml:space="preserve">- Miss rate</w:t>
+      </w:r>
+      <w:r>
+        <w:t xml:space="preserve"> </w:t>
+      </w:r>
+      <w:r>
+        <w:rPr>
+          <w:b/>
+          <w:bCs/>
+        </w:rPr>
+        <w:t xml:space="preserve">&gt;40%</w:t>
+      </w:r>
+      <w:r>
+        <w:t xml:space="preserve"> </w:t>
+      </w:r>
+      <w:r>
+        <w:t xml:space="preserve">= cache too small, hot set không fit</w:t>
+      </w:r>
+      <w:r>
+        <w:t xml:space="preserve"> </w:t>
+      </w:r>
+      <w:r>
+        <w:t xml:space="preserve">- Miss rate</w:t>
+      </w:r>
+      <w:r>
+        <w:t xml:space="preserve"> </w:t>
+      </w:r>
+      <w:r>
+        <w:rPr>
+          <w:b/>
+          <w:bCs/>
+        </w:rPr>
+        <w:t xml:space="preserve">&lt;5%</w:t>
+      </w:r>
+      <w:r>
+        <w:t xml:space="preserve"> </w:t>
+      </w:r>
+      <w:r>
+        <w:t xml:space="preserve">= TTL quá dài, data stale risk</w:t>
+      </w:r>
+    </w:p>
+    <w:p>
+      <w:pPr>
+        <w:pStyle w:val="BodyText"/>
+      </w:pPr>
+      <w:r>
+        <w:rPr>
+          <w:b/>
+          <w:bCs/>
+        </w:rPr>
+        <w:t xml:space="preserve">Risk Thundering Herd</w:t>
+      </w:r>
+      <w:r>
+        <w:t xml:space="preserve">:</w:t>
+      </w:r>
+      <w:r>
+        <w:t xml:space="preserve"> </w:t>
+      </w:r>
+      <w:r>
+        <w:t xml:space="preserve">&gt; Nếu 1 key hot expired đồng thời, 10K request cùng miss → 10K request đập DB cùng lúc → DB sập.</w:t>
+      </w:r>
+      <w:r>
+        <w:t xml:space="preserve"> </w:t>
+      </w:r>
+      <w:r>
+        <w:t xml:space="preserve">&gt; Mitigation:</w:t>
+      </w:r>
+      <w:r>
+        <w:t xml:space="preserve"> </w:t>
+      </w:r>
+      <w:r>
+        <w:rPr>
+          <w:b/>
+          <w:bCs/>
+        </w:rPr>
+        <w:t xml:space="preserve">singleflight pattern</w:t>
+      </w:r>
+      <w:r>
+        <w:t xml:space="preserve"> </w:t>
+      </w:r>
+      <w:r>
+        <w:t xml:space="preserve">(1 request đi DB, 9,999 chờ) hoặc</w:t>
+      </w:r>
+      <w:r>
+        <w:t xml:space="preserve"> </w:t>
+      </w:r>
+      <w:r>
+        <w:rPr>
+          <w:b/>
+          <w:bCs/>
+        </w:rPr>
+        <w:t xml:space="preserve">probabilistic early expiration</w:t>
+      </w:r>
+      <w:r>
+        <w:t xml:space="preserve">.</w:t>
+      </w:r>
+    </w:p>
+    <w:p>
+      <w:pPr>
+        <w:pStyle w:val="BodyText"/>
+      </w:pPr>
+      <w:r>
+        <w:rPr>
+          <w:b/>
+          <w:bCs/>
+        </w:rPr>
+        <w:t xml:space="preserve">Câu Senior nói trong interview</w:t>
+      </w:r>
+      <w:r>
+        <w:t xml:space="preserve">:</w:t>
+      </w:r>
+      <w:r>
+        <w:t xml:space="preserve"> </w:t>
+      </w:r>
+      <w:r>
+        <w:t xml:space="preserve">&gt;</w:t>
+      </w:r>
+      <w:r>
+        <w:t xml:space="preserve"> </w:t>
+      </w:r>
+      <w:r>
+        <w:t xml:space="preserve">“Cache hit ratio không chỉ là performance —</w:t>
+      </w:r>
+      <w:r>
+        <w:t xml:space="preserve"> </w:t>
+      </w:r>
+      <w:r>
+        <w:rPr>
+          <w:b/>
+          <w:bCs/>
+        </w:rPr>
+        <w:t xml:space="preserve">nó quyết định kiến trúc DB</w:t>
+      </w:r>
+      <w:r>
+        <w:t xml:space="preserve">. 80% hit → 1 cluster r6g.large. 50% hit → phải 4 cluster shard. Đây là</w:t>
+      </w:r>
+      <w:r>
+        <w:t xml:space="preserve"> </w:t>
+      </w:r>
+      <w:r>
+        <w:rPr>
+          <w:b/>
+          <w:bCs/>
+        </w:rPr>
+        <w:t xml:space="preserve">đòn bẩy lớn nhất</w:t>
+      </w:r>
+      <w:r>
+        <w:t xml:space="preserve"> </w:t>
+      </w:r>
+      <w:r>
+        <w:t xml:space="preserve">trong system design e-commerce.”</w:t>
+      </w:r>
+    </w:p>
+    <w:p>
+      <w:r>
+        <w:pict>
+          <v:rect style="width:0;height:1.5pt" o:hralign="center" o:hrstd="t" o:hr="t"/>
+        </w:pict>
+      </w:r>
+    </w:p>
+    <w:bookmarkEnd w:id="41"/>
+    <w:bookmarkEnd w:id="42"/>
+    <w:bookmarkStart w:id="43" w:name="step-3-5-chưa-demo-hẹn-session-sau"/>
+    <w:p>
+      <w:pPr>
+        <w:pStyle w:val="Heading3"/>
+      </w:pPr>
+      <w:r>
+        <w:t xml:space="preserve">Step 3-5 — chưa demo (hẹn session sau)</w:t>
+      </w:r>
+    </w:p>
+    <w:tbl>
+      <w:tblPr>
+        <w:tblStyle w:val="Table"/>
+        <w:tblW w:type="pct" w:w="5000"/>
+        <w:tblLayout w:type="fixed"/>
+        <w:tblLook w:firstRow="1" w:lastRow="0" w:firstColumn="0" w:lastColumn="0" w:noHBand="0" w:noVBand="0" w:val="0020"/>
+      </w:tblPr>
+      <w:tblGrid>
+        <w:gridCol w:w="3960"/>
+        <w:gridCol w:w="3960"/>
+      </w:tblGrid>
+      <w:tr>
+        <w:trPr>
+          <w:tblHeader w:val="on"/>
+        </w:trPr>
+        <w:tc>
+          <w:tcPr/>
+          <w:p>
+            <w:pPr>
+              <w:pStyle w:val="Compact"/>
+            </w:pPr>
+            <w:r>
+              <w:t xml:space="preserve">Step</w:t>
+            </w:r>
+          </w:p>
+        </w:tc>
+        <w:tc>
+          <w:tcPr/>
+          <w:p>
+            <w:pPr>
+              <w:pStyle w:val="Compact"/>
+            </w:pPr>
+            <w:r>
+              <w:t xml:space="preserve">Nội dung kế hoạch</w:t>
+            </w:r>
+          </w:p>
+        </w:tc>
+      </w:tr>
+      <w:tr>
+        <w:tc>
+          <w:tcPr/>
+          <w:p>
+            <w:pPr>
+              <w:pStyle w:val="Compact"/>
+            </w:pPr>
+            <w:r>
+              <w:rPr>
+                <w:b/>
+                <w:bCs/>
+              </w:rPr>
+              <w:t xml:space="preserve">3 DESIGN</w:t>
+            </w:r>
+          </w:p>
+        </w:tc>
+        <w:tc>
+          <w:tcPr/>
+          <w:p>
+            <w:pPr>
+              <w:pStyle w:val="Compact"/>
+            </w:pPr>
+            <w:r>
+              <w:t xml:space="preserve">CloudFront → ALB → EKS (3 NS dev/stg/prd) → SQS async checkout → Aurora + ElastiCache Redis. Vẽ boxes &amp; arrows numbered</w:t>
+            </w:r>
+          </w:p>
+        </w:tc>
+      </w:tr>
+      <w:tr>
+        <w:tc>
+          <w:tcPr/>
+          <w:p>
+            <w:pPr>
+              <w:pStyle w:val="Compact"/>
+            </w:pPr>
+            <w:r>
+              <w:rPr>
+                <w:b/>
+                <w:bCs/>
+              </w:rPr>
+              <w:t xml:space="preserve">4 DEEP DIVE</w:t>
+            </w:r>
+          </w:p>
+        </w:tc>
+        <w:tc>
+          <w:tcPr/>
+          <w:p>
+            <w:pPr>
+              <w:pStyle w:val="Compact"/>
+            </w:pPr>
+            <w:r>
+              <w:t xml:space="preserve">Idempotency key checkout (mất tiền nếu retry kép), SQS DLQ, sharding khi &gt;50K rps, circuit breaker, rate limit</w:t>
+            </w:r>
+          </w:p>
+        </w:tc>
+      </w:tr>
+      <w:tr>
+        <w:tc>
+          <w:tcPr/>
+          <w:p>
+            <w:pPr>
+              <w:pStyle w:val="Compact"/>
+            </w:pPr>
+            <w:r>
+              <w:rPr>
+                <w:b/>
+                <w:bCs/>
+              </w:rPr>
+              <w:t xml:space="preserve">5 TRADE-OFF</w:t>
+            </w:r>
+          </w:p>
+        </w:tc>
+        <w:tc>
+          <w:tcPr/>
+          <w:p>
+            <w:pPr>
+              <w:pStyle w:val="Compact"/>
+            </w:pPr>
+            <w:r>
+              <w:t xml:space="preserve">Multi-AZ Singapore ($X/month, SLA 99.95%, RTO 30min) vs Multi-region Sin+Tokyo ($3X, SLA 99.99%, RTO 5min). Trả lời CEO:</w:t>
+            </w:r>
+            <w:r>
+              <w:t xml:space="preserve"> </w:t>
+            </w:r>
+            <w:r>
+              <w:t xml:space="preserve">“12.12 dùng multi-AZ + pre-warm 30 phút, multi-region để sau quý sau khi traffic 30K rps”</w:t>
+            </w:r>
+          </w:p>
+        </w:tc>
+      </w:tr>
+    </w:tbl>
+    <w:p>
+      <w:r>
+        <w:pict>
+          <v:rect style="width:0;height:1.5pt" o:hralign="center" o:hrstd="t" o:hr="t"/>
+        </w:pict>
+      </w:r>
+    </w:p>
+    <w:bookmarkEnd w:id="43"/>
+    <w:bookmarkStart w:id="44" w:name="insight-session-cho-user-đọc-lại"/>
+    <w:p>
+      <w:pPr>
+        <w:pStyle w:val="Heading3"/>
+      </w:pPr>
+      <w:r>
+        <w:t xml:space="preserve">Insight session (cho user đọc lại)</w:t>
+      </w:r>
+    </w:p>
+    <w:p>
+      <w:pPr>
+        <w:pStyle w:val="FirstParagraph"/>
+      </w:pPr>
+      <w:r>
+        <w:t xml:space="preserve">User chưa làm system design bao giờ → cần học</w:t>
+      </w:r>
+      <w:r>
+        <w:t xml:space="preserve"> </w:t>
+      </w:r>
+      <w:r>
+        <w:rPr>
+          <w:b/>
+          <w:bCs/>
+        </w:rPr>
+        <w:t xml:space="preserve">4 thứ</w:t>
+      </w:r>
+      <w:r>
+        <w:t xml:space="preserve">:</w:t>
+      </w:r>
+    </w:p>
+    <w:p>
+      <w:pPr>
+        <w:pStyle w:val="Compact"/>
+        <w:numPr>
+          <w:ilvl w:val="0"/>
+          <w:numId w:val="1006"/>
+        </w:numPr>
+      </w:pPr>
+      <w:r>
+        <w:rPr>
+          <w:b/>
+          <w:bCs/>
+        </w:rPr>
+        <w:t xml:space="preserve">Framework có sẵn</w:t>
+      </w:r>
+      <w:r>
+        <w:t xml:space="preserve"> </w:t>
+      </w:r>
+      <w:r>
+        <w:t xml:space="preserve">(RESHADED) — không nghĩ random, đi theo step</w:t>
+      </w:r>
+    </w:p>
+    <w:p>
+      <w:pPr>
+        <w:pStyle w:val="Compact"/>
+        <w:numPr>
+          <w:ilvl w:val="0"/>
+          <w:numId w:val="1006"/>
+        </w:numPr>
+      </w:pPr>
+      <w:r>
+        <w:rPr>
+          <w:b/>
+          <w:bCs/>
+        </w:rPr>
+        <w:t xml:space="preserve">Anchor numbers</w:t>
+      </w:r>
+      <w:r>
+        <w:t xml:space="preserve"> </w:t>
+      </w:r>
+      <w:r>
+        <w:t xml:space="preserve">— thuộc 5 số để self-defend khi probe</w:t>
+      </w:r>
+    </w:p>
+    <w:p>
+      <w:pPr>
+        <w:pStyle w:val="Compact"/>
+        <w:numPr>
+          <w:ilvl w:val="0"/>
+          <w:numId w:val="1006"/>
+        </w:numPr>
+      </w:pPr>
+      <w:r>
+        <w:rPr>
+          <w:b/>
+          <w:bCs/>
+        </w:rPr>
+        <w:t xml:space="preserve">Pattern interview</w:t>
+      </w:r>
+      <w:r>
+        <w:t xml:space="preserve">:</w:t>
+      </w:r>
+      <w:r>
+        <w:t xml:space="preserve"> </w:t>
+      </w:r>
+      <w:r>
+        <w:t xml:space="preserve">“em assume X dựa Y, verify bằng Z”</w:t>
+      </w:r>
+      <w:r>
+        <w:t xml:space="preserve"> </w:t>
+      </w:r>
+      <w:r>
+        <w:t xml:space="preserve">— signal data-driven</w:t>
+      </w:r>
+    </w:p>
+    <w:p>
+      <w:pPr>
+        <w:pStyle w:val="Compact"/>
+        <w:numPr>
+          <w:ilvl w:val="0"/>
+          <w:numId w:val="1006"/>
+        </w:numPr>
+      </w:pPr>
+      <w:r>
+        <w:rPr>
+          <w:b/>
+          <w:bCs/>
+        </w:rPr>
+        <w:t xml:space="preserve">Rút dây động rừng</w:t>
+      </w:r>
+      <w:r>
+        <w:t xml:space="preserve">: 1 con số đổi → cascade nhiều thứ</w:t>
+      </w:r>
+    </w:p>
+    <w:p>
+      <w:pPr>
+        <w:pStyle w:val="Compact"/>
+        <w:numPr>
+          <w:ilvl w:val="1"/>
+          <w:numId w:val="1007"/>
+        </w:numPr>
+      </w:pPr>
+      <w:r>
+        <w:t xml:space="preserve">Cache hit % → DB instance → cost → SLA chuỗi</w:t>
+      </w:r>
+    </w:p>
+    <w:p>
+      <w:pPr>
+        <w:pStyle w:val="Compact"/>
+        <w:numPr>
+          <w:ilvl w:val="1"/>
+          <w:numId w:val="1007"/>
+        </w:numPr>
+      </w:pPr>
+      <w:r>
+        <w:t xml:space="preserve">Pod rps → node count → multi-AZ → instance family</w:t>
+      </w:r>
+    </w:p>
+    <w:p>
+      <w:pPr>
+        <w:pStyle w:val="Compact"/>
+        <w:numPr>
+          <w:ilvl w:val="1"/>
+          <w:numId w:val="1007"/>
+        </w:numPr>
+      </w:pPr>
+      <w:r>
+        <w:t xml:space="preserve">SLA × số service = SLA chuỗi (weakest link)</w:t>
+      </w:r>
+    </w:p>
+    <w:p>
+      <w:pPr>
+        <w:pStyle w:val="FirstParagraph"/>
+      </w:pPr>
+      <w:r>
+        <w:rPr>
+          <w:b/>
+          <w:bCs/>
+        </w:rPr>
+        <w:t xml:space="preserve">Câu nói vàng kết Step 2</w:t>
+      </w:r>
+      <w:r>
+        <w:t xml:space="preserve">:</w:t>
+      </w:r>
+      <w:r>
+        <w:t xml:space="preserve"> </w:t>
+      </w:r>
+      <w:r>
+        <w:t xml:space="preserve">&gt;</w:t>
+      </w:r>
+      <w:r>
+        <w:t xml:space="preserve"> </w:t>
+      </w:r>
+      <w:r>
+        <w:t xml:space="preserve">“Capacity estimate là</w:t>
+      </w:r>
+      <w:r>
+        <w:t xml:space="preserve"> </w:t>
+      </w:r>
+      <w:r>
+        <w:rPr>
+          <w:b/>
+          <w:bCs/>
+        </w:rPr>
+        <w:t xml:space="preserve">hypothesis</w:t>
+      </w:r>
+      <w:r>
+        <w:t xml:space="preserve">, không phải fact. Em assume dựa anchor industry, sẽ verify bằng staging benchmark + production metric tuần đầu. Nếu sai → recalculate cascade ngay.”</w:t>
+      </w:r>
+    </w:p>
+    <w:p>
+      <w:r>
+        <w:pict>
+          <v:rect style="width:0;height:1.5pt" o:hralign="center" o:hrstd="t" o:hr="t"/>
+        </w:pict>
+      </w:r>
+    </w:p>
+    <w:bookmarkEnd w:id="44"/>
+    <w:bookmarkEnd w:id="45"/>
+    <w:bookmarkStart w:id="47" w:name="câu-sắp-tới-next"/>
     <w:p>
       <w:pPr>
         <w:pStyle w:val="Heading2"/>
       </w:pPr>
       <w:r>
+        <w:t xml:space="preserve">🎯 Câu sắp tới (NEXT)</w:t>
+      </w:r>
+    </w:p>
+    <w:bookmarkStart w:id="46" w:name="câu-4-mid-pod-oomkilled"/>
+    <w:p>
+      <w:pPr>
+        <w:pStyle w:val="Heading3"/>
+      </w:pPr>
+      <w:r>
+        <w:t xml:space="preserve">Câu 4 [MID+] — Pod OOMKilled</w:t>
+      </w:r>
+    </w:p>
+    <w:p>
+      <w:pPr>
+        <w:pStyle w:val="BlockText"/>
+      </w:pPr>
+      <w:r>
+        <w:t xml:space="preserve">Pod app</w:t>
+      </w:r>
+      <w:r>
+        <w:t xml:space="preserve"> </w:t>
+      </w:r>
+      <w:r>
+        <w:rPr>
+          <w:rStyle w:val="VerbatimChar"/>
+        </w:rPr>
+        <w:t xml:space="preserve">orders-prd</w:t>
+      </w:r>
+      <w:r>
+        <w:t xml:space="preserve"> </w:t>
+      </w:r>
+      <w:r>
+        <w:t xml:space="preserve">đang chạy ổn 2 tuần. Đêm qua deploy version mới, sáng anh thấy pod restart 12 lần,</w:t>
+      </w:r>
+      <w:r>
+        <w:t xml:space="preserve"> </w:t>
+      </w:r>
+      <w:r>
+        <w:rPr>
+          <w:rStyle w:val="VerbatimChar"/>
+        </w:rPr>
+        <w:t xml:space="preserve">RESTARTS=12</w:t>
+      </w:r>
+      <w:r>
+        <w:t xml:space="preserve">.</w:t>
+      </w:r>
+      <w:r>
+        <w:t xml:space="preserve"> </w:t>
+      </w:r>
+      <w:r>
+        <w:rPr>
+          <w:rStyle w:val="VerbatimChar"/>
+        </w:rPr>
+        <w:t xml:space="preserve">kubectl describe</w:t>
+      </w:r>
+      <w:r>
+        <w:t xml:space="preserve"> </w:t>
+      </w:r>
+      <w:r>
+        <w:t xml:space="preserve">thấy</w:t>
+      </w:r>
+      <w:r>
+        <w:t xml:space="preserve"> </w:t>
+      </w:r>
+      <w:r>
+        <w:rPr>
+          <w:rStyle w:val="VerbatimChar"/>
+        </w:rPr>
+        <w:t xml:space="preserve">Last State: Terminated, Reason: OOMKilled, Exit Code: 137</w:t>
+      </w:r>
+      <w:r>
+        <w:t xml:space="preserve">. Anh:</w:t>
+      </w:r>
+    </w:p>
+    <w:p>
+      <w:pPr>
+        <w:pStyle w:val="Compact"/>
+        <w:numPr>
+          <w:ilvl w:val="0"/>
+          <w:numId w:val="1008"/>
+        </w:numPr>
+      </w:pPr>
+      <w:r>
+        <w:t xml:space="preserve">Tăng</w:t>
+      </w:r>
+      <w:r>
+        <w:t xml:space="preserve"> </w:t>
+      </w:r>
+      <w:r>
+        <w:rPr>
+          <w:rStyle w:val="VerbatimChar"/>
+        </w:rPr>
+        <w:t xml:space="preserve">resources.limits.memory</w:t>
+      </w:r>
+      <w:r>
+        <w:t xml:space="preserve"> </w:t>
+      </w:r>
+      <w:r>
+        <w:t xml:space="preserve">cho qua, hay tìm memory leak?</w:t>
+      </w:r>
+    </w:p>
+    <w:p>
+      <w:pPr>
+        <w:pStyle w:val="Compact"/>
+        <w:numPr>
+          <w:ilvl w:val="0"/>
+          <w:numId w:val="1008"/>
+        </w:numPr>
+      </w:pPr>
+      <w:r>
+        <w:t xml:space="preserve">Trade-off mỗi cách?</w:t>
+      </w:r>
+    </w:p>
+    <w:p>
+      <w:pPr>
+        <w:pStyle w:val="Compact"/>
+        <w:numPr>
+          <w:ilvl w:val="0"/>
+          <w:numId w:val="1008"/>
+        </w:numPr>
+      </w:pPr>
+      <w:r>
+        <w:t xml:space="preserve">Lệnh anh gõ trong 5 phút đầu để quyết định?</w:t>
+      </w:r>
+    </w:p>
+    <w:p>
+      <w:pPr>
+        <w:pStyle w:val="FirstParagraph"/>
+      </w:pPr>
+      <w:r>
+        <w:t xml:space="preserve">→ Câu này test trade-off senior + tooling profiling (</w:t>
+      </w:r>
+      <w:r>
+        <w:rPr>
+          <w:rStyle w:val="VerbatimChar"/>
+        </w:rPr>
+        <w:t xml:space="preserve">kubectl top</w:t>
+      </w:r>
+      <w:r>
+        <w:t xml:space="preserve">, container metrics, heap dump).</w:t>
+      </w:r>
+    </w:p>
+    <w:p>
+      <w:r>
+        <w:pict>
+          <v:rect style="width:0;height:1.5pt" o:hralign="center" o:hrstd="t" o:hr="t"/>
+        </w:pict>
+      </w:r>
+    </w:p>
+    <w:bookmarkEnd w:id="46"/>
+    <w:bookmarkEnd w:id="47"/>
+    <w:bookmarkStart w:id="48" w:name="cleanup-pending"/>
+    <w:p>
+      <w:pPr>
+        <w:pStyle w:val="Heading2"/>
+      </w:pPr>
+      <w:r>
+        <w:t xml:space="preserve">🧹 Cleanup pending</w:t>
+      </w:r>
+    </w:p>
+    <w:p>
+      <w:pPr>
+        <w:pStyle w:val="FirstParagraph"/>
+      </w:pPr>
+      <w:r>
+        <w:t xml:space="preserve">Pod giả lập còn live trên cluster (đến khi user delete):</w:t>
+      </w:r>
+    </w:p>
+    <w:p>
+      <w:pPr>
+        <w:pStyle w:val="SourceCode"/>
+      </w:pPr>
+      <w:r>
+        <w:rPr>
+          <w:rStyle w:val="ExtensionTok"/>
+        </w:rPr>
+        <w:t xml:space="preserve">kubectl</w:t>
+      </w:r>
+      <w:r>
+        <w:rPr>
+          <w:rStyle w:val="NormalTok"/>
+        </w:rPr>
+        <w:t xml:space="preserve"> delete pod crash-demo net-debug </w:t>
+      </w:r>
+      <w:r>
+        <w:rPr>
+          <w:rStyle w:val="AttributeTok"/>
+        </w:rPr>
+        <w:t xml:space="preserve">-n</w:t>
+      </w:r>
+      <w:r>
+        <w:rPr>
+          <w:rStyle w:val="NormalTok"/>
+        </w:rPr>
+        <w:t xml:space="preserve"> dev</w:t>
+      </w:r>
+    </w:p>
+    <w:p>
+      <w:r>
+        <w:pict>
+          <v:rect style="width:0;height:1.5pt" o:hralign="center" o:hrstd="t" o:hr="t"/>
+        </w:pict>
+      </w:r>
+    </w:p>
+    <w:bookmarkEnd w:id="48"/>
+    <w:bookmarkStart w:id="49" w:name="resume-protocol"/>
+    <w:p>
+      <w:pPr>
+        <w:pStyle w:val="Heading2"/>
+      </w:pPr>
+      <w:r>
         <w:t xml:space="preserve">🔁 Resume protocol</w:t>
       </w:r>
     </w:p>
@@ -4891,8 +8855,8 @@
         <w:t xml:space="preserve">5. File update sau mỗi 2-3 câu mới (commit + push).</w:t>
       </w:r>
     </w:p>
-    <w:bookmarkEnd w:id="35"/>
-    <w:bookmarkEnd w:id="36"/>
+    <w:bookmarkEnd w:id="49"/>
+    <w:bookmarkEnd w:id="50"/>
     <w:sectPr>
       <w:footnotePr>
         <w:numRestart w:val="eachSect"/>
@@ -5191,6 +9155,91 @@
       </w:pPr>
     </w:lvl>
   </w:abstractNum>
+  <w:abstractNum w:abstractNumId="99413">
+    <w:nsid w:val="00A99413"/>
+    <w:multiLevelType w:val="multilevel"/>
+    <w:lvl w:ilvl="0">
+      <w:start w:val="3"/>
+      <w:numFmt w:val="decimal"/>
+      <w:lvlText w:val="%1."/>
+      <w:lvlJc w:val="left"/>
+      <w:pPr>
+        <w:ind w:left="720" w:hanging="360"/>
+      </w:pPr>
+    </w:lvl>
+    <w:lvl w:ilvl="1">
+      <w:start w:val="3"/>
+      <w:numFmt w:val="decimal"/>
+      <w:lvlText w:val="%2."/>
+      <w:lvlJc w:val="left"/>
+      <w:pPr>
+        <w:ind w:left="1440" w:hanging="360"/>
+      </w:pPr>
+    </w:lvl>
+    <w:lvl w:ilvl="2">
+      <w:start w:val="3"/>
+      <w:numFmt w:val="decimal"/>
+      <w:lvlText w:val="%3."/>
+      <w:lvlJc w:val="left"/>
+      <w:pPr>
+        <w:ind w:left="2160" w:hanging="360"/>
+      </w:pPr>
+    </w:lvl>
+    <w:lvl w:ilvl="3">
+      <w:start w:val="3"/>
+      <w:numFmt w:val="decimal"/>
+      <w:lvlText w:val="%4."/>
+      <w:lvlJc w:val="left"/>
+      <w:pPr>
+        <w:ind w:left="2880" w:hanging="360"/>
+      </w:pPr>
+    </w:lvl>
+    <w:lvl w:ilvl="4">
+      <w:start w:val="3"/>
+      <w:numFmt w:val="decimal"/>
+      <w:lvlText w:val="%5."/>
+      <w:lvlJc w:val="left"/>
+      <w:pPr>
+        <w:ind w:left="3600" w:hanging="360"/>
+      </w:pPr>
+    </w:lvl>
+    <w:lvl w:ilvl="5">
+      <w:start w:val="3"/>
+      <w:numFmt w:val="decimal"/>
+      <w:lvlText w:val="%6."/>
+      <w:lvlJc w:val="left"/>
+      <w:pPr>
+        <w:ind w:left="4320" w:hanging="360"/>
+      </w:pPr>
+    </w:lvl>
+    <w:lvl w:ilvl="6">
+      <w:start w:val="3"/>
+      <w:numFmt w:val="decimal"/>
+      <w:lvlText w:val="%7."/>
+      <w:lvlJc w:val="left"/>
+      <w:pPr>
+        <w:ind w:left="5040" w:hanging="360"/>
+      </w:pPr>
+    </w:lvl>
+    <w:lvl w:ilvl="7">
+      <w:start w:val="3"/>
+      <w:numFmt w:val="decimal"/>
+      <w:lvlText w:val="%8."/>
+      <w:lvlJc w:val="left"/>
+      <w:pPr>
+        <w:ind w:left="5760" w:hanging="360"/>
+      </w:pPr>
+    </w:lvl>
+    <w:lvl w:ilvl="8">
+      <w:start w:val="3"/>
+      <w:numFmt w:val="decimal"/>
+      <w:lvlText w:val="%9."/>
+      <w:lvlJc w:val="left"/>
+      <w:pPr>
+        <w:ind w:left="6480" w:hanging="360"/>
+      </w:pPr>
+    </w:lvl>
+  </w:abstractNum>
   <w:num w:numId="1000">
     <w:abstractNumId w:val="990"/>
   </w:num>
@@ -5201,6 +9250,102 @@
     <w:abstractNumId w:val="991"/>
   </w:num>
   <w:num w:numId="1003">
+    <w:abstractNumId w:val="99411"/>
+    <w:lvlOverride w:ilvl="0">
+      <w:startOverride w:val="1"/>
+    </w:lvlOverride>
+    <w:lvlOverride w:ilvl="1">
+      <w:startOverride w:val="1"/>
+    </w:lvlOverride>
+    <w:lvlOverride w:ilvl="2">
+      <w:startOverride w:val="1"/>
+    </w:lvlOverride>
+    <w:lvlOverride w:ilvl="3">
+      <w:startOverride w:val="1"/>
+    </w:lvlOverride>
+    <w:lvlOverride w:ilvl="4">
+      <w:startOverride w:val="1"/>
+    </w:lvlOverride>
+    <w:lvlOverride w:ilvl="5">
+      <w:startOverride w:val="1"/>
+    </w:lvlOverride>
+    <w:lvlOverride w:ilvl="6">
+      <w:startOverride w:val="1"/>
+    </w:lvlOverride>
+    <w:lvlOverride w:ilvl="7">
+      <w:startOverride w:val="1"/>
+    </w:lvlOverride>
+    <w:lvlOverride w:ilvl="8">
+      <w:startOverride w:val="1"/>
+    </w:lvlOverride>
+  </w:num>
+  <w:num w:numId="1004">
+    <w:abstractNumId w:val="99413"/>
+    <w:lvlOverride w:ilvl="0">
+      <w:startOverride w:val="3"/>
+    </w:lvlOverride>
+    <w:lvlOverride w:ilvl="1">
+      <w:startOverride w:val="3"/>
+    </w:lvlOverride>
+    <w:lvlOverride w:ilvl="2">
+      <w:startOverride w:val="3"/>
+    </w:lvlOverride>
+    <w:lvlOverride w:ilvl="3">
+      <w:startOverride w:val="3"/>
+    </w:lvlOverride>
+    <w:lvlOverride w:ilvl="4">
+      <w:startOverride w:val="3"/>
+    </w:lvlOverride>
+    <w:lvlOverride w:ilvl="5">
+      <w:startOverride w:val="3"/>
+    </w:lvlOverride>
+    <w:lvlOverride w:ilvl="6">
+      <w:startOverride w:val="3"/>
+    </w:lvlOverride>
+    <w:lvlOverride w:ilvl="7">
+      <w:startOverride w:val="3"/>
+    </w:lvlOverride>
+    <w:lvlOverride w:ilvl="8">
+      <w:startOverride w:val="3"/>
+    </w:lvlOverride>
+  </w:num>
+  <w:num w:numId="1005">
+    <w:abstractNumId w:val="991"/>
+  </w:num>
+  <w:num w:numId="1006">
+    <w:abstractNumId w:val="99411"/>
+    <w:lvlOverride w:ilvl="0">
+      <w:startOverride w:val="1"/>
+    </w:lvlOverride>
+    <w:lvlOverride w:ilvl="1">
+      <w:startOverride w:val="1"/>
+    </w:lvlOverride>
+    <w:lvlOverride w:ilvl="2">
+      <w:startOverride w:val="1"/>
+    </w:lvlOverride>
+    <w:lvlOverride w:ilvl="3">
+      <w:startOverride w:val="1"/>
+    </w:lvlOverride>
+    <w:lvlOverride w:ilvl="4">
+      <w:startOverride w:val="1"/>
+    </w:lvlOverride>
+    <w:lvlOverride w:ilvl="5">
+      <w:startOverride w:val="1"/>
+    </w:lvlOverride>
+    <w:lvlOverride w:ilvl="6">
+      <w:startOverride w:val="1"/>
+    </w:lvlOverride>
+    <w:lvlOverride w:ilvl="7">
+      <w:startOverride w:val="1"/>
+    </w:lvlOverride>
+    <w:lvlOverride w:ilvl="8">
+      <w:startOverride w:val="1"/>
+    </w:lvlOverride>
+  </w:num>
+  <w:num w:numId="1007">
+    <w:abstractNumId w:val="991"/>
+  </w:num>
+  <w:num w:numId="1008">
     <w:abstractNumId w:val="99411"/>
     <w:lvlOverride w:ilvl="0">
       <w:startOverride w:val="1"/>

</xml_diff>

<commit_message>
docs(mock-interview): roadmap 2 tháng 56 ngày — DevOps Senior 5+ remote
- 8 tuần × 7 ngày = 56 ngày, ~165 câu Q1-Q150 + 4 system design + 5 STAR Lab A++
- Tuần 1-2 K8s, Tuần 3 AWS Net+Sec, Tuần 4 CI/CD+Deploy+English, Tuần 5 IaC+Obs (apply job start D34), Tuần 6 outage scenario, Tuần 7 system design, Tuần 8 STAR+mock loop full
- Pattern 1 ngày: sáng 5 câu mới (60min) + tối ôn 5 câu hôm qua (30min) + cuối tuần mock
- Spaced repetition matrix: D ôn D-1, cuối tuần ôn cả tuần, tuần kế random probe
- 12 deliverable file (README + roadmap + 6 topic file + STAR + mock log + apply tracker)
- Salary target $1800-2500 realistic, $2500+ cần CKA/AWS SA Pro

Co-Authored-By: Claude Opus 4.7 (1M context) <noreply@anthropic.com>
</commit_message>
<xml_diff>
--- a/docs/mock-interview/README.docx
+++ b/docs/mock-interview/README.docx
@@ -2,7 +2,7 @@
 <file path=word/document.xml><?xml version="1.0" encoding="utf-8"?>
 <w:document xmlns:w="http://schemas.openxmlformats.org/wordprocessingml/2006/main" xmlns:m="http://schemas.openxmlformats.org/officeDocument/2006/math" xmlns:r="http://schemas.openxmlformats.org/officeDocument/2006/relationships" xmlns:o="urn:schemas-microsoft-com:office:office" xmlns:v="urn:schemas-microsoft-com:vml" xmlns:w10="urn:schemas-microsoft-com:office:word" xmlns:a="http://schemas.openxmlformats.org/drawingml/2006/main" xmlns:pic="http://schemas.openxmlformats.org/drawingml/2006/picture" xmlns:wp="http://schemas.openxmlformats.org/drawingml/2006/wordprocessingDrawing">
   <w:body>
-    <w:bookmarkStart w:id="50" w:name="mock-interview-devopssre-senior-5"/>
+    <w:bookmarkStart w:id="51" w:name="mock-interview-devopssre-senior-5"/>
     <w:p>
       <w:pPr>
         <w:pStyle w:val="Heading1"/>
@@ -39,6 +39,51 @@
       </w:r>
       <w:r>
         <w:t xml:space="preserve">: 2026-05-10 — sau khi đóng Buổi 0.7.9 DORA, chuyển sang khai thác sâu Sub-comp 0..9 + 0.7.x đã build thay vì tiếp Phase 1 Security.</w:t>
+      </w:r>
+    </w:p>
+    <w:p>
+      <w:pPr>
+        <w:pStyle w:val="BlockText"/>
+      </w:pPr>
+      <w:r>
+        <w:rPr>
+          <w:b/>
+          <w:bCs/>
+        </w:rPr>
+        <w:t xml:space="preserve">Update 2026-05-11</w:t>
+      </w:r>
+      <w:r>
+        <w:t xml:space="preserve">: thêm</w:t>
+      </w:r>
+      <w:r>
+        <w:t xml:space="preserve"> </w:t>
+      </w:r>
+      <w:r>
+        <w:rPr>
+          <w:b/>
+          <w:bCs/>
+        </w:rPr>
+        <w:t xml:space="preserve">roadmap 2 tháng</w:t>
+      </w:r>
+      <w:r>
+        <w:t xml:space="preserve"> </w:t>
+      </w:r>
+      <w:r>
+        <w:t xml:space="preserve">(56 ngày) — xem</w:t>
+      </w:r>
+      <w:r>
+        <w:t xml:space="preserve"> </w:t>
+      </w:r>
+      <w:hyperlink r:id="rId9">
+        <w:r>
+          <w:rPr>
+            <w:rStyle w:val="VerbatimChar"/>
+          </w:rPr>
+          <w:t xml:space="preserve">roadmap-2-month.md</w:t>
+        </w:r>
+      </w:hyperlink>
+      <w:r>
+        <w:t xml:space="preserve">. File này (README) ghi 4 câu đã demo + tiến độ session ngắn. File roadmap ghi plan từng ngày D1-D56.</w:t>
       </w:r>
     </w:p>
     <w:p>
@@ -48,7 +93,7 @@
         </w:pict>
       </w:r>
     </w:p>
-    <w:bookmarkStart w:id="9" w:name="plan-tuần-17-câu-mix-level"/>
+    <w:bookmarkStart w:id="10" w:name="plan-tuần-17-câu-mix-level"/>
     <w:p>
       <w:pPr>
         <w:pStyle w:val="Heading2"/>
@@ -849,8 +894,8 @@
         </w:pict>
       </w:r>
     </w:p>
-    <w:bookmarkEnd w:id="9"/>
-    <w:bookmarkStart w:id="11" w:name="tiến-độ-session-2026-05-10-2026-05-11"/>
+    <w:bookmarkEnd w:id="10"/>
+    <w:bookmarkStart w:id="12" w:name="tiến-độ-session-2026-05-10-2026-05-11"/>
     <w:p>
       <w:pPr>
         <w:pStyle w:val="Heading2"/>
@@ -883,7 +928,7 @@
         <w:t xml:space="preserve">([MID]×2 + [MID+]×1 + [SENIOR]×1 demo).</w:t>
       </w:r>
     </w:p>
-    <w:bookmarkStart w:id="10" w:name="tổng-chấm-điểm-baseline"/>
+    <w:bookmarkStart w:id="11" w:name="tổng-chấm-điểm-baseline"/>
     <w:p>
       <w:pPr>
         <w:pStyle w:val="Heading3"/>
@@ -1230,9 +1275,9 @@
         </w:pict>
       </w:r>
     </w:p>
-    <w:bookmarkEnd w:id="10"/>
     <w:bookmarkEnd w:id="11"/>
-    <w:bookmarkStart w:id="17" w:name="câu-1-mid-pod-crashloopbackoff"/>
+    <w:bookmarkEnd w:id="12"/>
+    <w:bookmarkStart w:id="18" w:name="câu-1-mid-pod-crashloopbackoff"/>
     <w:p>
       <w:pPr>
         <w:pStyle w:val="Heading2"/>
@@ -1241,7 +1286,7 @@
         <w:t xml:space="preserve">📚 Câu 1 [MID] — Pod CrashLoopBackOff</w:t>
       </w:r>
     </w:p>
-    <w:bookmarkStart w:id="12" w:name="setup-giả-lập-đã-chạy-live-trên-cluster"/>
+    <w:bookmarkStart w:id="13" w:name="setup-giả-lập-đã-chạy-live-trên-cluster"/>
     <w:p>
       <w:pPr>
         <w:pStyle w:val="Heading3"/>
@@ -1312,8 +1357,8 @@
         <w:t xml:space="preserve">lặp.</w:t>
       </w:r>
     </w:p>
-    <w:bookmarkEnd w:id="12"/>
-    <w:bookmarkStart w:id="13" w:name="methodology-5-bước-vàng"/>
+    <w:bookmarkEnd w:id="13"/>
+    <w:bookmarkStart w:id="14" w:name="methodology-5-bước-vàng"/>
     <w:p>
       <w:pPr>
         <w:pStyle w:val="Heading3"/>
@@ -1426,8 +1471,8 @@
         <w:t xml:space="preserve">, vì container đang trong back-off thì log hiện tại có thể trống.</w:t>
       </w:r>
     </w:p>
-    <w:bookmarkEnd w:id="13"/>
-    <w:bookmarkStart w:id="14" w:name="exit-codes-phải-thuộc"/>
+    <w:bookmarkEnd w:id="14"/>
+    <w:bookmarkStart w:id="15" w:name="exit-codes-phải-thuộc"/>
     <w:p>
       <w:pPr>
         <w:pStyle w:val="Heading3"/>
@@ -1608,8 +1653,8 @@
         </w:tc>
       </w:tr>
     </w:tbl>
-    <w:bookmarkEnd w:id="14"/>
-    <w:bookmarkStart w:id="15" w:name="vì-sao-spawn-pod-debug-riêng"/>
+    <w:bookmarkEnd w:id="15"/>
+    <w:bookmarkStart w:id="16" w:name="vì-sao-spawn-pod-debug-riêng"/>
     <w:p>
       <w:pPr>
         <w:pStyle w:val="Heading3"/>
@@ -2314,8 +2359,8 @@
         <w:t xml:space="preserve">]}</w:t>
       </w:r>
     </w:p>
-    <w:bookmarkEnd w:id="15"/>
-    <w:bookmarkStart w:id="16" w:name="senior-insight"/>
+    <w:bookmarkEnd w:id="16"/>
+    <w:bookmarkStart w:id="17" w:name="senior-insight"/>
     <w:p>
       <w:pPr>
         <w:pStyle w:val="Heading3"/>
@@ -2572,9 +2617,9 @@
         </w:pict>
       </w:r>
     </w:p>
-    <w:bookmarkEnd w:id="16"/>
     <w:bookmarkEnd w:id="17"/>
-    <w:bookmarkStart w:id="24" w:name="câu-2-mid-service-không-reach"/>
+    <w:bookmarkEnd w:id="18"/>
+    <w:bookmarkStart w:id="25" w:name="câu-2-mid-service-không-reach"/>
     <w:p>
       <w:pPr>
         <w:pStyle w:val="Heading2"/>
@@ -2583,7 +2628,7 @@
         <w:t xml:space="preserve">📚 Câu 2 [MID] — Service không reach</w:t>
       </w:r>
     </w:p>
-    <w:bookmarkStart w:id="18" w:name="câu-hỏi"/>
+    <w:bookmarkStart w:id="19" w:name="câu-hỏi"/>
     <w:p>
       <w:pPr>
         <w:pStyle w:val="Heading3"/>
@@ -2654,8 +2699,8 @@
         <w:t xml:space="preserve">từ pod khác → timeout.</w:t>
       </w:r>
     </w:p>
-    <w:bookmarkEnd w:id="18"/>
-    <w:bookmarkStart w:id="19" w:name="user-trả-lời-baseline"/>
+    <w:bookmarkEnd w:id="19"/>
+    <w:bookmarkStart w:id="20" w:name="user-trả-lời-baseline"/>
     <w:p>
       <w:pPr>
         <w:pStyle w:val="Heading3"/>
@@ -2672,8 +2717,8 @@
         <w:t xml:space="preserve">“Check DNS, check ping”</w:t>
       </w:r>
     </w:p>
-    <w:bookmarkEnd w:id="19"/>
-    <w:bookmarkStart w:id="20" w:name="Xc609028093ec9c9a6d3c9563c8673ff71fc05cd"/>
+    <w:bookmarkEnd w:id="20"/>
+    <w:bookmarkStart w:id="21" w:name="Xc609028093ec9c9a6d3c9563c8673ff71fc05cd"/>
     <w:p>
       <w:pPr>
         <w:pStyle w:val="Heading3"/>
@@ -2805,8 +2850,8 @@
         <w:t xml:space="preserve">trong K8s.</w:t>
       </w:r>
     </w:p>
-    <w:bookmarkEnd w:id="20"/>
-    <w:bookmarkStart w:id="21" w:name="service-endpoints-khái-niệm-k8s-specific"/>
+    <w:bookmarkEnd w:id="21"/>
+    <w:bookmarkStart w:id="22" w:name="service-endpoints-khái-niệm-k8s-specific"/>
     <w:p>
       <w:pPr>
         <w:pStyle w:val="Heading3"/>
@@ -3024,8 +3069,8 @@
         <w:t xml:space="preserve">)</w:t>
       </w:r>
     </w:p>
-    <w:bookmarkEnd w:id="21"/>
-    <w:bookmarkStart w:id="22" w:name="lệnh-debug-senior-gõ-đầu-tiên"/>
+    <w:bookmarkEnd w:id="22"/>
+    <w:bookmarkStart w:id="23" w:name="lệnh-debug-senior-gõ-đầu-tiên"/>
     <w:p>
       <w:pPr>
         <w:pStyle w:val="Heading3"/>
@@ -3153,8 +3198,8 @@
         <w:t xml:space="preserve">→ Endpoints OK → vấn đề ở app/port/NetworkPolicy</w:t>
       </w:r>
     </w:p>
-    <w:bookmarkEnd w:id="22"/>
-    <w:bookmarkStart w:id="23" w:name="senior-5-answer-mẫu"/>
+    <w:bookmarkEnd w:id="23"/>
+    <w:bookmarkStart w:id="24" w:name="senior-5-answer-mẫu"/>
     <w:p>
       <w:pPr>
         <w:pStyle w:val="Heading3"/>
@@ -3256,9 +3301,9 @@
         </w:pict>
       </w:r>
     </w:p>
-    <w:bookmarkEnd w:id="23"/>
     <w:bookmarkEnd w:id="24"/>
-    <w:bookmarkStart w:id="31" w:name="câu-3-mid-http-404-vs-502-phân-biệt-tầng"/>
+    <w:bookmarkEnd w:id="25"/>
+    <w:bookmarkStart w:id="32" w:name="câu-3-mid-http-404-vs-502-phân-biệt-tầng"/>
     <w:p>
       <w:pPr>
         <w:pStyle w:val="Heading2"/>
@@ -3267,7 +3312,7 @@
         <w:t xml:space="preserve">📚 Câu 3 [MID+] — HTTP 404 vs 502 phân biệt tầng</w:t>
       </w:r>
     </w:p>
-    <w:bookmarkStart w:id="25" w:name="câu-hỏi-1"/>
+    <w:bookmarkStart w:id="26" w:name="câu-hỏi-1"/>
     <w:p>
       <w:pPr>
         <w:pStyle w:val="Heading3"/>
@@ -3366,8 +3411,8 @@
         <w:t xml:space="preserve">Phân biệt 2 status do tầng nào sinh + lệnh debug.</w:t>
       </w:r>
     </w:p>
-    <w:bookmarkEnd w:id="25"/>
-    <w:bookmarkStart w:id="26" w:name="user-trả-lời-baseline-1"/>
+    <w:bookmarkEnd w:id="26"/>
+    <w:bookmarkStart w:id="27" w:name="user-trả-lời-baseline-1"/>
     <w:p>
       <w:pPr>
         <w:pStyle w:val="Heading3"/>
@@ -3384,8 +3429,8 @@
         <w:t xml:space="preserve">“502 ở tầng routing. 404 do tầng app code.”</w:t>
       </w:r>
     </w:p>
-    <w:bookmarkEnd w:id="26"/>
-    <w:bookmarkStart w:id="27" w:name="sai-502-không-phải-tầng-routing"/>
+    <w:bookmarkEnd w:id="27"/>
+    <w:bookmarkStart w:id="28" w:name="sai-502-không-phải-tầng-routing"/>
     <w:p>
       <w:pPr>
         <w:pStyle w:val="Heading3"/>
@@ -3588,8 +3633,8 @@
         <w:t xml:space="preserve">= gateway timeout (target không kịp trả)</w:t>
       </w:r>
     </w:p>
-    <w:bookmarkEnd w:id="27"/>
-    <w:bookmarkStart w:id="28" w:name="đúng-tầng-app-nhưng-2-lớp-có-thể-trả"/>
+    <w:bookmarkEnd w:id="28"/>
+    <w:bookmarkStart w:id="29" w:name="đúng-tầng-app-nhưng-2-lớp-có-thể-trả"/>
     <w:p>
       <w:pPr>
         <w:pStyle w:val="Heading3"/>
@@ -3769,8 +3814,8 @@
         <w:t xml:space="preserve">default backend</w:t>
       </w:r>
     </w:p>
-    <w:bookmarkEnd w:id="28"/>
-    <w:bookmarkStart w:id="29" w:name="lệnh-debug"/>
+    <w:bookmarkEnd w:id="29"/>
+    <w:bookmarkStart w:id="30" w:name="lệnh-debug"/>
     <w:p>
       <w:pPr>
         <w:pStyle w:val="Heading3"/>
@@ -4545,8 +4590,8 @@
         <w:t xml:space="preserve">"users\|404"</w:t>
       </w:r>
     </w:p>
-    <w:bookmarkEnd w:id="29"/>
-    <w:bookmarkStart w:id="30" w:name="senior-pattern-dễ-nhớ"/>
+    <w:bookmarkEnd w:id="30"/>
+    <w:bookmarkStart w:id="31" w:name="senior-pattern-dễ-nhớ"/>
     <w:p>
       <w:pPr>
         <w:pStyle w:val="Heading3"/>
@@ -4633,9 +4678,9 @@
         </w:pict>
       </w:r>
     </w:p>
-    <w:bookmarkEnd w:id="30"/>
     <w:bookmarkEnd w:id="31"/>
-    <w:bookmarkStart w:id="45" w:name="X1d8d7400d70a319eae79ded9ce9e77c05bdd31a"/>
+    <w:bookmarkEnd w:id="32"/>
+    <w:bookmarkStart w:id="46" w:name="X1d8d7400d70a319eae79ded9ce9e77c05bdd31a"/>
     <w:p>
       <w:pPr>
         <w:pStyle w:val="Heading2"/>
@@ -4672,7 +4717,7 @@
         <w:t xml:space="preserve">, hẹn session sau khi user vững Step 1-2.</w:t>
       </w:r>
     </w:p>
-    <w:bookmarkStart w:id="32" w:name="câu-hỏi-gốc"/>
+    <w:bookmarkStart w:id="33" w:name="câu-hỏi-gốc"/>
     <w:p>
       <w:pPr>
         <w:pStyle w:val="Heading3"/>
@@ -4721,8 +4766,8 @@
         <w:t xml:space="preserve">trong 2h. Em design như nào? Multi-AZ scale lên có đủ chưa, hay phải multi-region? Cost vs SLA trade-off thế nào?</w:t>
       </w:r>
     </w:p>
-    <w:bookmarkEnd w:id="32"/>
-    <w:bookmarkStart w:id="33" w:name="user-context"/>
+    <w:bookmarkEnd w:id="33"/>
+    <w:bookmarkStart w:id="34" w:name="user-context"/>
     <w:p>
       <w:pPr>
         <w:pStyle w:val="Heading3"/>
@@ -4755,8 +4800,8 @@
         </w:pict>
       </w:r>
     </w:p>
-    <w:bookmarkEnd w:id="33"/>
-    <w:bookmarkStart w:id="34" w:name="X35946f745494ce7b4d2217aba9d4f3a3a63512b"/>
+    <w:bookmarkEnd w:id="34"/>
+    <w:bookmarkStart w:id="35" w:name="X35946f745494ce7b4d2217aba9d4f3a3a63512b"/>
     <w:p>
       <w:pPr>
         <w:pStyle w:val="Heading3"/>
@@ -5125,8 +5170,8 @@
         </w:pict>
       </w:r>
     </w:p>
-    <w:bookmarkEnd w:id="34"/>
-    <w:bookmarkStart w:id="35" w:name="step-1-clarify-5-phút"/>
+    <w:bookmarkEnd w:id="35"/>
+    <w:bookmarkStart w:id="36" w:name="step-1-clarify-5-phút"/>
     <w:p>
       <w:pPr>
         <w:pStyle w:val="Heading3"/>
@@ -5540,8 +5585,8 @@
         </w:pict>
       </w:r>
     </w:p>
-    <w:bookmarkEnd w:id="35"/>
-    <w:bookmarkStart w:id="36" w:name="Xa67c921d618f39288fa2f128d2071d2a59672b0"/>
+    <w:bookmarkEnd w:id="36"/>
+    <w:bookmarkStart w:id="37" w:name="Xa67c921d618f39288fa2f128d2071d2a59672b0"/>
     <w:p>
       <w:pPr>
         <w:pStyle w:val="Heading3"/>
@@ -5908,8 +5953,8 @@
         </w:pict>
       </w:r>
     </w:p>
-    <w:bookmarkEnd w:id="36"/>
-    <w:bookmarkStart w:id="42" w:name="step-2-estimate-10-phút"/>
+    <w:bookmarkEnd w:id="37"/>
+    <w:bookmarkStart w:id="43" w:name="step-2-estimate-10-phút"/>
     <w:p>
       <w:pPr>
         <w:pStyle w:val="Heading3"/>
@@ -5918,7 +5963,7 @@
         <w:t xml:space="preserve">Step 2 — ESTIMATE (10 phút)</w:t>
       </w:r>
     </w:p>
-    <w:bookmarkStart w:id="37" w:name="strategy-khi-không-có-production-number"/>
+    <w:bookmarkStart w:id="38" w:name="strategy-khi-không-có-production-number"/>
     <w:p>
       <w:pPr>
         <w:pStyle w:val="Heading4"/>
@@ -6273,8 +6318,8 @@
         </w:pict>
       </w:r>
     </w:p>
-    <w:bookmarkEnd w:id="37"/>
-    <w:bookmarkStart w:id="38" w:name="tính-1-traffic-split"/>
+    <w:bookmarkEnd w:id="38"/>
+    <w:bookmarkStart w:id="39" w:name="tính-1-traffic-split"/>
     <w:p>
       <w:pPr>
         <w:pStyle w:val="Heading4"/>
@@ -6446,8 +6491,8 @@
         </w:pict>
       </w:r>
     </w:p>
-    <w:bookmarkEnd w:id="38"/>
-    <w:bookmarkStart w:id="39" w:name="tính-2-compute"/>
+    <w:bookmarkEnd w:id="39"/>
+    <w:bookmarkStart w:id="40" w:name="tính-2-compute"/>
     <w:p>
       <w:pPr>
         <w:pStyle w:val="Heading4"/>
@@ -6979,8 +7024,8 @@
         </w:pict>
       </w:r>
     </w:p>
-    <w:bookmarkEnd w:id="39"/>
-    <w:bookmarkStart w:id="40" w:name="tính-3-db-iops"/>
+    <w:bookmarkEnd w:id="40"/>
+    <w:bookmarkStart w:id="41" w:name="tính-3-db-iops"/>
     <w:p>
       <w:pPr>
         <w:pStyle w:val="Heading4"/>
@@ -7710,8 +7755,8 @@
         </w:pict>
       </w:r>
     </w:p>
-    <w:bookmarkEnd w:id="40"/>
-    <w:bookmarkStart w:id="41" w:name="insight-cache-hitmiss-vàng-nhất-step-2"/>
+    <w:bookmarkEnd w:id="41"/>
+    <w:bookmarkStart w:id="42" w:name="insight-cache-hitmiss-vàng-nhất-step-2"/>
     <w:p>
       <w:pPr>
         <w:pStyle w:val="Heading4"/>
@@ -8168,9 +8213,9 @@
         </w:pict>
       </w:r>
     </w:p>
-    <w:bookmarkEnd w:id="41"/>
     <w:bookmarkEnd w:id="42"/>
-    <w:bookmarkStart w:id="43" w:name="step-3-5-chưa-demo-hẹn-session-sau"/>
+    <w:bookmarkEnd w:id="43"/>
+    <w:bookmarkStart w:id="44" w:name="step-3-5-chưa-demo-hẹn-session-sau"/>
     <w:p>
       <w:pPr>
         <w:pStyle w:val="Heading3"/>
@@ -8315,8 +8360,8 @@
         </w:pict>
       </w:r>
     </w:p>
-    <w:bookmarkEnd w:id="43"/>
-    <w:bookmarkStart w:id="44" w:name="insight-session-cho-user-đọc-lại"/>
+    <w:bookmarkEnd w:id="44"/>
+    <w:bookmarkStart w:id="45" w:name="insight-session-cho-user-đọc-lại"/>
     <w:p>
       <w:pPr>
         <w:pStyle w:val="Heading3"/>
@@ -8523,9 +8568,9 @@
         </w:pict>
       </w:r>
     </w:p>
-    <w:bookmarkEnd w:id="44"/>
     <w:bookmarkEnd w:id="45"/>
-    <w:bookmarkStart w:id="47" w:name="câu-sắp-tới-next"/>
+    <w:bookmarkEnd w:id="46"/>
+    <w:bookmarkStart w:id="48" w:name="câu-sắp-tới-next"/>
     <w:p>
       <w:pPr>
         <w:pStyle w:val="Heading2"/>
@@ -8534,7 +8579,7 @@
         <w:t xml:space="preserve">🎯 Câu sắp tới (NEXT)</w:t>
       </w:r>
     </w:p>
-    <w:bookmarkStart w:id="46" w:name="câu-4-mid-pod-oomkilled"/>
+    <w:bookmarkStart w:id="47" w:name="câu-4-mid-pod-oomkilled"/>
     <w:p>
       <w:pPr>
         <w:pStyle w:val="Heading3"/>
@@ -8680,9 +8725,9 @@
         </w:pict>
       </w:r>
     </w:p>
-    <w:bookmarkEnd w:id="46"/>
     <w:bookmarkEnd w:id="47"/>
-    <w:bookmarkStart w:id="48" w:name="cleanup-pending"/>
+    <w:bookmarkEnd w:id="48"/>
+    <w:bookmarkStart w:id="49" w:name="cleanup-pending"/>
     <w:p>
       <w:pPr>
         <w:pStyle w:val="Heading2"/>
@@ -8735,8 +8780,8 @@
         </w:pict>
       </w:r>
     </w:p>
-    <w:bookmarkEnd w:id="48"/>
-    <w:bookmarkStart w:id="49" w:name="resume-protocol"/>
+    <w:bookmarkEnd w:id="49"/>
+    <w:bookmarkStart w:id="50" w:name="resume-protocol"/>
     <w:p>
       <w:pPr>
         <w:pStyle w:val="Heading2"/>
@@ -8855,8 +8900,8 @@
         <w:t xml:space="preserve">5. File update sau mỗi 2-3 câu mới (commit + push).</w:t>
       </w:r>
     </w:p>
-    <w:bookmarkEnd w:id="49"/>
     <w:bookmarkEnd w:id="50"/>
+    <w:bookmarkEnd w:id="51"/>
     <w:sectPr>
       <w:footnotePr>
         <w:numRestart w:val="eachSect"/>

</xml_diff>